<commit_message>
Update PPT design and add male/female AI voice versions
</commit_message>
<xml_diff>
--- a/source/oss-training-scripts.docx
+++ b/source/oss-training-scripts.docx
@@ -1,6 +1,6 @@
 
 <file path=word/document.xml><?xml version="1.0" encoding="utf-8"?>
-<w:document xmlns:wpc="http://schemas.microsoft.com/office/word/2010/wordprocessingCanvas" xmlns:cx="http://schemas.microsoft.com/office/drawing/2014/chartex" xmlns:cx1="http://schemas.microsoft.com/office/drawing/2015/9/8/chartex" xmlns:cx2="http://schemas.microsoft.com/office/drawing/2015/10/21/chartex" xmlns:cx3="http://schemas.microsoft.com/office/drawing/2016/5/9/chartex" xmlns:cx4="http://schemas.microsoft.com/office/drawing/2016/5/10/chartex" xmlns:cx5="http://schemas.microsoft.com/office/drawing/2016/5/11/chartex" xmlns:cx6="http://schemas.microsoft.com/office/drawing/2016/5/12/chartex" xmlns:cx7="http://schemas.microsoft.com/office/drawing/2016/5/13/chartex" xmlns:cx8="http://schemas.microsoft.com/office/drawing/2016/5/14/chartex" xmlns:mc="http://schemas.openxmlformats.org/markup-compatibility/2006" xmlns:aink="http://schemas.microsoft.com/office/drawing/2016/ink" xmlns:am3d="http://schemas.microsoft.com/office/drawing/2017/model3d" xmlns:o="urn:schemas-microsoft-com:office:office" xmlns:r="http://schemas.openxmlformats.org/officeDocument/2006/relationships" xmlns:m="http://schemas.openxmlformats.org/officeDocument/2006/math" xmlns:v="urn:schemas-microsoft-com:vml" xmlns:wp14="http://schemas.microsoft.com/office/word/2010/wordprocessingDrawing" xmlns:wp="http://schemas.openxmlformats.org/drawingml/2006/wordprocessingDrawing" xmlns:w10="urn:schemas-microsoft-com:office:word" xmlns:w="http://schemas.openxmlformats.org/wordprocessingml/2006/main" xmlns:w14="http://schemas.microsoft.com/office/word/2010/wordml" xmlns:w15="http://schemas.microsoft.com/office/word/2012/wordml" xmlns:w16cex="http://schemas.microsoft.com/office/word/2018/wordml/cex" xmlns:w16cid="http://schemas.microsoft.com/office/word/2016/wordml/cid" xmlns:w16="http://schemas.microsoft.com/office/word/2018/wordml" xmlns:w16sdtdh="http://schemas.microsoft.com/office/word/2020/wordml/sdtdatahash" xmlns:w16se="http://schemas.microsoft.com/office/word/2015/wordml/symex" xmlns:wpg="http://schemas.microsoft.com/office/word/2010/wordprocessingGroup" xmlns:wpi="http://schemas.microsoft.com/office/word/2010/wordprocessingInk" xmlns:wne="http://schemas.microsoft.com/office/word/2006/wordml" xmlns:wps="http://schemas.microsoft.com/office/word/2010/wordprocessingShape" mc:Ignorable="w14 w15 w16se w16cid w16 w16cex w16sdtdh wp14">
+<w:document xmlns:wpc="http://schemas.microsoft.com/office/word/2010/wordprocessingCanvas" xmlns:cx="http://schemas.microsoft.com/office/drawing/2014/chartex" xmlns:cx1="http://schemas.microsoft.com/office/drawing/2015/9/8/chartex" xmlns:cx2="http://schemas.microsoft.com/office/drawing/2015/10/21/chartex" xmlns:cx3="http://schemas.microsoft.com/office/drawing/2016/5/9/chartex" xmlns:cx4="http://schemas.microsoft.com/office/drawing/2016/5/10/chartex" xmlns:cx5="http://schemas.microsoft.com/office/drawing/2016/5/11/chartex" xmlns:cx6="http://schemas.microsoft.com/office/drawing/2016/5/12/chartex" xmlns:cx7="http://schemas.microsoft.com/office/drawing/2016/5/13/chartex" xmlns:cx8="http://schemas.microsoft.com/office/drawing/2016/5/14/chartex" xmlns:mc="http://schemas.openxmlformats.org/markup-compatibility/2006" xmlns:aink="http://schemas.microsoft.com/office/drawing/2016/ink" xmlns:am3d="http://schemas.microsoft.com/office/drawing/2017/model3d" xmlns:o="urn:schemas-microsoft-com:office:office" xmlns:oel="http://schemas.microsoft.com/office/2019/extlst" xmlns:r="http://schemas.openxmlformats.org/officeDocument/2006/relationships" xmlns:m="http://schemas.openxmlformats.org/officeDocument/2006/math" xmlns:v="urn:schemas-microsoft-com:vml" xmlns:wp14="http://schemas.microsoft.com/office/word/2010/wordprocessingDrawing" xmlns:wp="http://schemas.openxmlformats.org/drawingml/2006/wordprocessingDrawing" xmlns:w10="urn:schemas-microsoft-com:office:word" xmlns:w="http://schemas.openxmlformats.org/wordprocessingml/2006/main" xmlns:w14="http://schemas.microsoft.com/office/word/2010/wordml" xmlns:w15="http://schemas.microsoft.com/office/word/2012/wordml" xmlns:w16cex="http://schemas.microsoft.com/office/word/2018/wordml/cex" xmlns:w16cid="http://schemas.microsoft.com/office/word/2016/wordml/cid" xmlns:w16="http://schemas.microsoft.com/office/word/2018/wordml" xmlns:w16du="http://schemas.microsoft.com/office/word/2023/wordml/word16du" xmlns:w16sdtdh="http://schemas.microsoft.com/office/word/2020/wordml/sdtdatahash" xmlns:w16sdtfl="http://schemas.microsoft.com/office/word/2024/wordml/sdtformatlock" xmlns:w16se="http://schemas.microsoft.com/office/word/2015/wordml/symex" xmlns:wpg="http://schemas.microsoft.com/office/word/2010/wordprocessingGroup" xmlns:wpi="http://schemas.microsoft.com/office/word/2010/wordprocessingInk" xmlns:wne="http://schemas.microsoft.com/office/word/2006/wordml" xmlns:wps="http://schemas.microsoft.com/office/word/2010/wordprocessingShape" mc:Ignorable="w14 w15 w16se w16cid w16 w16cex w16sdtdh w16sdtfl w16du wp14">
   <w:body>
     <w:tbl>
       <w:tblPr>
@@ -65,6 +65,15 @@
                 <w:szCs w:val="20"/>
               </w:rPr>
             </w:pPr>
+            <w:r>
+              <w:rPr>
+                <w:rFonts w:asciiTheme="minorEastAsia" w:hAnsiTheme="minorEastAsia" w:hint="eastAsia"/>
+                <w:b/>
+                <w:i/>
+                <w:szCs w:val="20"/>
+              </w:rPr>
+              <w:t xml:space="preserve"> </w:t>
+            </w:r>
           </w:p>
         </w:tc>
       </w:tr>
@@ -618,88 +627,25 @@
         <w:tc>
           <w:tcPr>
             <w:tcW w:w="6256" w:type="dxa"/>
-            <w:shd w:val="clear" w:color="auto" w:fill="auto"/>
-          </w:tcPr>
-          <w:p>
-            <w:pPr>
-              <w:pStyle w:val="a5"/>
-              <w:rPr>
-                <w:rFonts w:asciiTheme="minorEastAsia" w:hAnsiTheme="minorEastAsia"/>
-                <w:sz w:val="18"/>
-                <w:szCs w:val="18"/>
-              </w:rPr>
-            </w:pPr>
-            <w:r>
-              <w:rPr>
-                <w:rFonts w:asciiTheme="minorEastAsia" w:hAnsiTheme="minorEastAsia" w:hint="eastAsia"/>
+          </w:tcPr>
+          <w:p>
+            <w:pPr>
+              <w:pStyle w:val="a5"/>
+              <w:rPr>
+                <w:rFonts w:asciiTheme="minorEastAsia" w:hAnsiTheme="minorEastAsia"/>
                 <w:color w:val="000000" w:themeColor="text1"/>
                 <w:sz w:val="18"/>
                 <w:szCs w:val="18"/>
               </w:rPr>
-              <w:t>이</w:t>
-            </w:r>
-            <w:r>
-              <w:rPr>
-                <w:rFonts w:asciiTheme="minorEastAsia" w:hAnsiTheme="minorEastAsia" w:hint="eastAsia"/>
+            </w:pPr>
+            <w:r>
+              <w:rPr>
+                <w:rFonts w:asciiTheme="minorEastAsia" w:hAnsiTheme="minorEastAsia"/>
                 <w:color w:val="000000" w:themeColor="text1"/>
                 <w:sz w:val="18"/>
                 <w:szCs w:val="18"/>
               </w:rPr>
-              <w:t xml:space="preserve"> 교육에 사용된 음성은 </w:t>
-            </w:r>
-            <w:r>
-              <w:rPr>
-                <w:rFonts w:asciiTheme="minorEastAsia" w:hAnsiTheme="minorEastAsia"/>
-                <w:color w:val="000000" w:themeColor="text1"/>
-                <w:sz w:val="18"/>
-                <w:szCs w:val="18"/>
-              </w:rPr>
-              <w:t>NCSOFT</w:t>
-            </w:r>
-            <w:r>
-              <w:rPr>
-                <w:rFonts w:asciiTheme="minorEastAsia" w:hAnsiTheme="minorEastAsia" w:hint="eastAsia"/>
-                <w:color w:val="000000" w:themeColor="text1"/>
-                <w:sz w:val="18"/>
-                <w:szCs w:val="18"/>
-              </w:rPr>
-              <w:t xml:space="preserve">의 </w:t>
-            </w:r>
-            <w:r>
-              <w:rPr>
-                <w:rFonts w:asciiTheme="minorEastAsia" w:hAnsiTheme="minorEastAsia"/>
-                <w:color w:val="000000" w:themeColor="text1"/>
-                <w:sz w:val="18"/>
-                <w:szCs w:val="18"/>
-              </w:rPr>
-              <w:t>Speech AI Lab</w:t>
-            </w:r>
-            <w:r>
-              <w:rPr>
-                <w:rFonts w:asciiTheme="minorEastAsia" w:hAnsiTheme="minorEastAsia" w:hint="eastAsia"/>
-                <w:color w:val="000000" w:themeColor="text1"/>
-                <w:sz w:val="18"/>
-                <w:szCs w:val="18"/>
-              </w:rPr>
-              <w:t xml:space="preserve">에서 개발한 </w:t>
-            </w:r>
-            <w:r>
-              <w:rPr>
-                <w:rFonts w:asciiTheme="minorEastAsia" w:hAnsiTheme="minorEastAsia"/>
-                <w:color w:val="000000" w:themeColor="text1"/>
-                <w:sz w:val="18"/>
-                <w:szCs w:val="18"/>
-              </w:rPr>
-              <w:t xml:space="preserve">AI </w:t>
-            </w:r>
-            <w:r>
-              <w:rPr>
-                <w:rFonts w:asciiTheme="minorEastAsia" w:hAnsiTheme="minorEastAsia" w:hint="eastAsia"/>
-                <w:color w:val="000000" w:themeColor="text1"/>
-                <w:sz w:val="18"/>
-                <w:szCs w:val="18"/>
-              </w:rPr>
-              <w:t>보이스를 사용하였습니다.</w:t>
+              <w:t>이 교육에 사용된 음성은 NC AI에서 개발한 VARCO Voice를 사용하였습니다.</w:t>
             </w:r>
           </w:p>
         </w:tc>
@@ -960,7 +906,6 @@
         <w:tc>
           <w:tcPr>
             <w:tcW w:w="6256" w:type="dxa"/>
-            <w:shd w:val="clear" w:color="auto" w:fill="auto"/>
           </w:tcPr>
           <w:p>
             <w:pPr>
@@ -1149,6 +1094,7 @@
               <w:lastRenderedPageBreak/>
               <w:t>첫 번째 챕터인 “저작권과 오픈소스 라이선스</w:t>
             </w:r>
+            <w:proofErr w:type="gramStart"/>
             <w:r>
               <w:rPr>
                 <w:rFonts w:asciiTheme="minorEastAsia" w:hAnsiTheme="minorEastAsia"/>
@@ -1163,7 +1109,16 @@
                 <w:sz w:val="18"/>
                 <w:szCs w:val="18"/>
               </w:rPr>
-              <w:t>에 대해 알아보겠습니다.</w:t>
+              <w:t>에</w:t>
+            </w:r>
+            <w:proofErr w:type="gramEnd"/>
+            <w:r>
+              <w:rPr>
+                <w:rFonts w:asciiTheme="minorEastAsia" w:hAnsiTheme="minorEastAsia" w:hint="eastAsia"/>
+                <w:sz w:val="18"/>
+                <w:szCs w:val="18"/>
+              </w:rPr>
+              <w:t xml:space="preserve"> 대해 알아보겠습니다.</w:t>
             </w:r>
           </w:p>
         </w:tc>
@@ -1773,7 +1728,23 @@
                 <w:sz w:val="18"/>
                 <w:szCs w:val="18"/>
               </w:rPr>
-              <w:t>이렇게 오픈소스와 상용 소프트웨어가 차이점들이 있다고 해도, 둘 다 지적재산권법으로 보호를 받고 있고 라이선스를 위반하게 되면 법적 처벌을 받을 수 있다는 점에서는 공통점도 있습니다.</w:t>
+              <w:t>이렇게 오픈소스와 상용 소프트웨어가 차이점들이 있다고 해도, 둘 다 지</w:t>
+            </w:r>
+            <w:r>
+              <w:rPr>
+                <w:rFonts w:asciiTheme="minorEastAsia" w:hAnsiTheme="minorEastAsia" w:hint="eastAsia"/>
+                <w:sz w:val="18"/>
+                <w:szCs w:val="18"/>
+              </w:rPr>
+              <w:t>식</w:t>
+            </w:r>
+            <w:r>
+              <w:rPr>
+                <w:rFonts w:asciiTheme="minorEastAsia" w:hAnsiTheme="minorEastAsia" w:hint="eastAsia"/>
+                <w:sz w:val="18"/>
+                <w:szCs w:val="18"/>
+              </w:rPr>
+              <w:t>재산권법으로 보호를 받고 있고 라이선스를 위반하게 되면 법적 처벌을 받을 수 있다는 점에서는 공통점도 있습니다.</w:t>
             </w:r>
           </w:p>
         </w:tc>
@@ -2471,12 +2442,21 @@
             </w:r>
             <w:r>
               <w:rPr>
-                <w:rFonts w:asciiTheme="minorEastAsia" w:hAnsiTheme="minorEastAsia"/>
+                <w:rFonts w:asciiTheme="minorEastAsia" w:hAnsiTheme="minorEastAsia" w:hint="eastAsia"/>
                 <w:color w:val="808080" w:themeColor="background1" w:themeShade="80"/>
                 <w:sz w:val="18"/>
                 <w:szCs w:val="18"/>
               </w:rPr>
-              <w:t>5p</w:t>
+              <w:t>6</w:t>
+            </w:r>
+            <w:r>
+              <w:rPr>
+                <w:rFonts w:asciiTheme="minorEastAsia" w:hAnsiTheme="minorEastAsia"/>
+                <w:color w:val="808080" w:themeColor="background1" w:themeShade="80"/>
+                <w:sz w:val="18"/>
+                <w:szCs w:val="18"/>
+              </w:rPr>
+              <w:t>p</w:t>
             </w:r>
             <w:r>
               <w:rPr>
@@ -2670,7 +2650,6 @@
         <w:tc>
           <w:tcPr>
             <w:tcW w:w="6256" w:type="dxa"/>
-            <w:shd w:val="clear" w:color="auto" w:fill="auto"/>
           </w:tcPr>
           <w:p>
             <w:pPr>
@@ -2799,7 +2778,6 @@
         <w:tc>
           <w:tcPr>
             <w:tcW w:w="6256" w:type="dxa"/>
-            <w:shd w:val="clear" w:color="auto" w:fill="auto"/>
           </w:tcPr>
           <w:p>
             <w:pPr>
@@ -2942,7 +2920,25 @@
                 <w:sz w:val="18"/>
                 <w:szCs w:val="18"/>
               </w:rPr>
-              <w:t>다시 라이선스로 돌아와서, 아무 제한 없이 사용할 수 있는 public domain 이라는 것이 있습니다.</w:t>
+              <w:t xml:space="preserve">다시 라이선스로 돌아와서, 아무 제한 없이 사용할 수 있는 public </w:t>
+            </w:r>
+            <w:proofErr w:type="gramStart"/>
+            <w:r>
+              <w:rPr>
+                <w:rFonts w:asciiTheme="minorEastAsia" w:hAnsiTheme="minorEastAsia" w:hint="eastAsia"/>
+                <w:sz w:val="18"/>
+                <w:szCs w:val="18"/>
+              </w:rPr>
+              <w:t>domain 이라는</w:t>
+            </w:r>
+            <w:proofErr w:type="gramEnd"/>
+            <w:r>
+              <w:rPr>
+                <w:rFonts w:asciiTheme="minorEastAsia" w:hAnsiTheme="minorEastAsia" w:hint="eastAsia"/>
+                <w:sz w:val="18"/>
+                <w:szCs w:val="18"/>
+              </w:rPr>
+              <w:t xml:space="preserve"> 것이 있습니다.</w:t>
             </w:r>
           </w:p>
           <w:p>
@@ -2978,7 +2974,25 @@
                 <w:sz w:val="18"/>
                 <w:szCs w:val="18"/>
               </w:rPr>
-              <w:t xml:space="preserve">단, 저작권자가 누군지 알 수 없다고 해서 모두 public domain 이라고 단정짓고 무단으로 사용해서는 안 됩니다. </w:t>
+              <w:t xml:space="preserve">단, 저작권자가 누군지 알 수 없다고 해서 모두 public </w:t>
+            </w:r>
+            <w:proofErr w:type="gramStart"/>
+            <w:r>
+              <w:rPr>
+                <w:rFonts w:asciiTheme="minorEastAsia" w:hAnsiTheme="minorEastAsia" w:hint="eastAsia"/>
+                <w:sz w:val="18"/>
+                <w:szCs w:val="18"/>
+              </w:rPr>
+              <w:t>domain 이라고</w:t>
+            </w:r>
+            <w:proofErr w:type="gramEnd"/>
+            <w:r>
+              <w:rPr>
+                <w:rFonts w:asciiTheme="minorEastAsia" w:hAnsiTheme="minorEastAsia" w:hint="eastAsia"/>
+                <w:sz w:val="18"/>
+                <w:szCs w:val="18"/>
+              </w:rPr>
+              <w:t xml:space="preserve"> 단정짓고 무단으로 사용해서는 안 됩니다. </w:t>
             </w:r>
           </w:p>
         </w:tc>
@@ -3361,41 +3375,23 @@
                 <w:sz w:val="18"/>
                 <w:szCs w:val="18"/>
               </w:rPr>
-              <w:t>사용 빈도 순으로 봤을 때 상위 10개의 라이선스가 전체 라이선스의 93%를 차지하고 있기 때문에 이 10개만 확실하게 알아두시면 됩니다.</w:t>
-            </w:r>
-          </w:p>
-          <w:p>
-            <w:pPr>
-              <w:pStyle w:val="a5"/>
-              <w:rPr>
-                <w:rFonts w:asciiTheme="minorEastAsia" w:hAnsiTheme="minorEastAsia"/>
-                <w:sz w:val="18"/>
-                <w:szCs w:val="18"/>
-              </w:rPr>
-            </w:pPr>
-            <w:r>
-              <w:rPr>
-                <w:rFonts w:asciiTheme="minorEastAsia" w:hAnsiTheme="minorEastAsia" w:hint="eastAsia"/>
-                <w:sz w:val="18"/>
-                <w:szCs w:val="18"/>
-              </w:rPr>
-              <w:t xml:space="preserve">맨 아래에 있는 AGPL 라이선스는 </w:t>
-            </w:r>
-            <w:r>
-              <w:rPr>
-                <w:rFonts w:asciiTheme="minorEastAsia" w:hAnsiTheme="minorEastAsia" w:hint="eastAsia"/>
-                <w:sz w:val="18"/>
-                <w:szCs w:val="18"/>
-              </w:rPr>
-              <w:t>웹 서비스를 통해 서비스를 제공하는 것도 배포로 보기 때문에 서버 전체의 소스코드를 공개해야 하는 의무가 있</w:t>
-            </w:r>
-            <w:r>
-              <w:rPr>
-                <w:rFonts w:asciiTheme="minorEastAsia" w:hAnsiTheme="minorEastAsia" w:hint="eastAsia"/>
-                <w:sz w:val="18"/>
-                <w:szCs w:val="18"/>
-              </w:rPr>
-              <w:t>어서 사용빈도는 낮지만 여기에 같이 적어 놓았습니다.</w:t>
+              <w:t xml:space="preserve">사용 빈도 순으로 봤을 때 상위 10개의 라이선스가 전체 라이선스의 </w:t>
+            </w:r>
+            <w:r>
+              <w:rPr>
+                <w:rFonts w:asciiTheme="minorEastAsia" w:hAnsiTheme="minorEastAsia" w:hint="eastAsia"/>
+                <w:sz w:val="18"/>
+                <w:szCs w:val="18"/>
+              </w:rPr>
+              <w:t>대부분을</w:t>
+            </w:r>
+            <w:r>
+              <w:rPr>
+                <w:rFonts w:asciiTheme="minorEastAsia" w:hAnsiTheme="minorEastAsia" w:hint="eastAsia"/>
+                <w:sz w:val="18"/>
+                <w:szCs w:val="18"/>
+              </w:rPr>
+              <w:t xml:space="preserve"> 차지하고 있기 때문에 이 10개만 확실하게 알아두시면 됩니다.</w:t>
             </w:r>
           </w:p>
         </w:tc>
@@ -3837,7 +3833,23 @@
                 <w:sz w:val="18"/>
                 <w:szCs w:val="18"/>
               </w:rPr>
-              <w:t>Copyleft의 로그는 Copyright의 C를 뒤집어 놓은 형태입니다.</w:t>
+              <w:t>Copyleft의 로</w:t>
+            </w:r>
+            <w:r>
+              <w:rPr>
+                <w:rFonts w:asciiTheme="minorEastAsia" w:hAnsiTheme="minorEastAsia" w:hint="eastAsia"/>
+                <w:sz w:val="18"/>
+                <w:szCs w:val="18"/>
+              </w:rPr>
+              <w:t>고</w:t>
+            </w:r>
+            <w:r>
+              <w:rPr>
+                <w:rFonts w:asciiTheme="minorEastAsia" w:hAnsiTheme="minorEastAsia" w:hint="eastAsia"/>
+                <w:sz w:val="18"/>
+                <w:szCs w:val="18"/>
+              </w:rPr>
+              <w:t>는 Copyright의 C를 뒤집어 놓은 형태입니다.</w:t>
             </w:r>
           </w:p>
         </w:tc>
@@ -3943,16 +3955,25 @@
                 <w:sz w:val="18"/>
                 <w:szCs w:val="18"/>
               </w:rPr>
-              <w:t>BSD 같은 건 배포할 때 사용자가 라이선스를 다른 걸로 바꾸는 것이 가능합니다. 그런데, Copyleft 라이선스는 원 라이선스를 변경하는 것이 불가능합니다. 여기서는 제가 GPL 라이선스를 예로 들었는데요. 한번 GPL</w:t>
-            </w:r>
-            <w:r>
-              <w:rPr>
-                <w:rFonts w:asciiTheme="minorEastAsia" w:hAnsiTheme="minorEastAsia" w:hint="eastAsia"/>
-                <w:sz w:val="18"/>
-                <w:szCs w:val="18"/>
-              </w:rPr>
-              <w:lastRenderedPageBreak/>
-              <w:t>은 영원히 GPL로 배포할 수 밖에 없습니다.</w:t>
+              <w:t xml:space="preserve">BSD 같은 건 배포할 때 사용자가 라이선스를 다른 걸로 바꾸는 것이 가능합니다. 그런데, Copyleft 라이선스는 원 라이선스를 변경하는 것이 불가능합니다. 여기서는 제가 GPL 라이선스를 예로 들었는데요. 한번 GPL은 영원히 GPL로 배포할 </w:t>
+            </w:r>
+            <w:proofErr w:type="gramStart"/>
+            <w:r>
+              <w:rPr>
+                <w:rFonts w:asciiTheme="minorEastAsia" w:hAnsiTheme="minorEastAsia" w:hint="eastAsia"/>
+                <w:sz w:val="18"/>
+                <w:szCs w:val="18"/>
+              </w:rPr>
+              <w:t>수 밖에</w:t>
+            </w:r>
+            <w:proofErr w:type="gramEnd"/>
+            <w:r>
+              <w:rPr>
+                <w:rFonts w:asciiTheme="minorEastAsia" w:hAnsiTheme="minorEastAsia" w:hint="eastAsia"/>
+                <w:sz w:val="18"/>
+                <w:szCs w:val="18"/>
+              </w:rPr>
+              <w:t xml:space="preserve"> 없습니다.</w:t>
             </w:r>
           </w:p>
         </w:tc>
@@ -4058,6 +4079,7 @@
                 <w:sz w:val="18"/>
                 <w:szCs w:val="18"/>
               </w:rPr>
+              <w:lastRenderedPageBreak/>
               <w:t>그러므로 소스를 공개할 마음이 없다면 copyleft 라이선스의 오픈소스를 사용하면 안 되겠죠?</w:t>
             </w:r>
           </w:p>
@@ -4164,7 +4186,25 @@
                 <w:sz w:val="18"/>
                 <w:szCs w:val="18"/>
               </w:rPr>
-              <w:t>먼저 GPL 인데요. GPL 라이선스의 오픈소스는 해당 바이너리 전체의 모든 소스코드를 공개해야 하는 의무가 있습니다.</w:t>
+              <w:t xml:space="preserve">먼저 </w:t>
+            </w:r>
+            <w:proofErr w:type="gramStart"/>
+            <w:r>
+              <w:rPr>
+                <w:rFonts w:asciiTheme="minorEastAsia" w:hAnsiTheme="minorEastAsia" w:hint="eastAsia"/>
+                <w:sz w:val="18"/>
+                <w:szCs w:val="18"/>
+              </w:rPr>
+              <w:t>GPL 인데요</w:t>
+            </w:r>
+            <w:proofErr w:type="gramEnd"/>
+            <w:r>
+              <w:rPr>
+                <w:rFonts w:asciiTheme="minorEastAsia" w:hAnsiTheme="minorEastAsia" w:hint="eastAsia"/>
+                <w:sz w:val="18"/>
+                <w:szCs w:val="18"/>
+              </w:rPr>
+              <w:t>. GPL 라이선스의 오픈소스는 해당 바이너리 전체의 모든 소스코드를 공개해야 하는 의무가 있습니다.</w:t>
             </w:r>
             <w:r>
               <w:rPr>
@@ -4487,7 +4527,25 @@
                 <w:sz w:val="18"/>
                 <w:szCs w:val="18"/>
               </w:rPr>
-              <w:t>GPL, AGPL 처럼 강한 copyleft 계열의 라이선스는 소스코드 공개 의무가 있</w:t>
+              <w:t xml:space="preserve">GPL, </w:t>
+            </w:r>
+            <w:proofErr w:type="gramStart"/>
+            <w:r>
+              <w:rPr>
+                <w:rFonts w:asciiTheme="minorEastAsia" w:hAnsiTheme="minorEastAsia" w:hint="eastAsia"/>
+                <w:sz w:val="18"/>
+                <w:szCs w:val="18"/>
+              </w:rPr>
+              <w:t>AGPL 처럼</w:t>
+            </w:r>
+            <w:proofErr w:type="gramEnd"/>
+            <w:r>
+              <w:rPr>
+                <w:rFonts w:asciiTheme="minorEastAsia" w:hAnsiTheme="minorEastAsia" w:hint="eastAsia"/>
+                <w:sz w:val="18"/>
+                <w:szCs w:val="18"/>
+              </w:rPr>
+              <w:t xml:space="preserve"> 강한 copyleft 계열의 라이선스는 소스코드 공개 의무가 있</w:t>
             </w:r>
             <w:r>
               <w:rPr>
@@ -4513,7 +4571,25 @@
                 <w:sz w:val="18"/>
                 <w:szCs w:val="18"/>
               </w:rPr>
-              <w:t>LGPL, EPL 처럼 약한 copyleft 계열의 라이선스는 수정해서 사용하거나 정적 링킹했을 때 오브젝트 코드 공개 의무가 있</w:t>
+              <w:t xml:space="preserve">LGPL, </w:t>
+            </w:r>
+            <w:proofErr w:type="gramStart"/>
+            <w:r>
+              <w:rPr>
+                <w:rFonts w:asciiTheme="minorEastAsia" w:hAnsiTheme="minorEastAsia" w:hint="eastAsia"/>
+                <w:sz w:val="18"/>
+                <w:szCs w:val="18"/>
+              </w:rPr>
+              <w:t>EPL 처럼</w:t>
+            </w:r>
+            <w:proofErr w:type="gramEnd"/>
+            <w:r>
+              <w:rPr>
+                <w:rFonts w:asciiTheme="minorEastAsia" w:hAnsiTheme="minorEastAsia" w:hint="eastAsia"/>
+                <w:sz w:val="18"/>
+                <w:szCs w:val="18"/>
+              </w:rPr>
+              <w:t xml:space="preserve"> 약한 copyleft 계열의 라이선스는 수정해서 사용하거나 정적 링킹했을 때 오브젝트 코드 공개 의무가 있</w:t>
             </w:r>
             <w:r>
               <w:rPr>
@@ -4616,15 +4692,118 @@
                 <w:sz w:val="18"/>
                 <w:szCs w:val="18"/>
               </w:rPr>
+              <w:t>33</w:t>
+            </w:r>
+          </w:p>
+        </w:tc>
+        <w:tc>
+          <w:tcPr>
+            <w:tcW w:w="2741" w:type="dxa"/>
+          </w:tcPr>
+          <w:p>
+            <w:pPr>
+              <w:pStyle w:val="a5"/>
+              <w:rPr>
+                <w:rFonts w:asciiTheme="minorEastAsia" w:hAnsiTheme="minorEastAsia"/>
+                <w:b/>
+                <w:bCs/>
+                <w:color w:val="FF0000"/>
+                <w:sz w:val="18"/>
+                <w:szCs w:val="18"/>
+              </w:rPr>
+            </w:pPr>
+            <w:r>
+              <w:rPr>
+                <w:rFonts w:asciiTheme="minorEastAsia" w:hAnsiTheme="minorEastAsia" w:hint="eastAsia"/>
+                <w:b/>
+                <w:bCs/>
+                <w:color w:val="FF0000"/>
+                <w:sz w:val="18"/>
+                <w:szCs w:val="18"/>
+              </w:rPr>
+              <w:t>목차 페이지</w:t>
+            </w:r>
+          </w:p>
+        </w:tc>
+        <w:tc>
+          <w:tcPr>
+            <w:tcW w:w="6256" w:type="dxa"/>
+          </w:tcPr>
+          <w:p>
+            <w:pPr>
+              <w:pStyle w:val="a5"/>
+              <w:rPr>
+                <w:rFonts w:asciiTheme="minorEastAsia" w:hAnsiTheme="minorEastAsia"/>
+                <w:b/>
+                <w:bCs/>
+                <w:color w:val="000000" w:themeColor="text1"/>
+                <w:sz w:val="18"/>
+                <w:szCs w:val="18"/>
+              </w:rPr>
+            </w:pPr>
+            <w:r>
+              <w:rPr>
+                <w:rFonts w:asciiTheme="minorEastAsia" w:hAnsiTheme="minorEastAsia" w:hint="eastAsia"/>
+                <w:b/>
+                <w:bCs/>
+                <w:color w:val="EE0000"/>
+                <w:sz w:val="18"/>
+                <w:szCs w:val="18"/>
+              </w:rPr>
+              <w:t>나중에 다른 곳으로 옮겨야 함</w:t>
+            </w:r>
+          </w:p>
+        </w:tc>
+        <w:tc>
+          <w:tcPr>
+            <w:tcW w:w="4175" w:type="dxa"/>
+          </w:tcPr>
+          <w:p>
+            <w:pPr>
+              <w:pStyle w:val="a5"/>
+              <w:rPr>
+                <w:rFonts w:asciiTheme="minorEastAsia" w:hAnsiTheme="minorEastAsia"/>
+                <w:b/>
+                <w:bCs/>
+                <w:color w:val="FF0000"/>
+                <w:sz w:val="18"/>
+                <w:szCs w:val="18"/>
+              </w:rPr>
+            </w:pPr>
+          </w:p>
+        </w:tc>
+      </w:tr>
+      <w:tr>
+        <w:tc>
+          <w:tcPr>
+            <w:tcW w:w="515" w:type="dxa"/>
+            <w:vAlign w:val="center"/>
+          </w:tcPr>
+          <w:p>
+            <w:pPr>
+              <w:pStyle w:val="a5"/>
+              <w:jc w:val="center"/>
+              <w:rPr>
+                <w:rFonts w:asciiTheme="minorEastAsia" w:hAnsiTheme="minorEastAsia"/>
+                <w:sz w:val="18"/>
+                <w:szCs w:val="18"/>
+              </w:rPr>
+            </w:pPr>
+            <w:r>
+              <w:rPr>
+                <w:rFonts w:asciiTheme="minorEastAsia" w:hAnsiTheme="minorEastAsia" w:hint="eastAsia"/>
+                <w:sz w:val="18"/>
+                <w:szCs w:val="18"/>
+              </w:rPr>
               <w:t>3</w:t>
             </w:r>
             <w:r>
               <w:rPr>
-                <w:rFonts w:asciiTheme="minorEastAsia" w:hAnsiTheme="minorEastAsia"/>
-                <w:sz w:val="18"/>
-                <w:szCs w:val="18"/>
-              </w:rPr>
-              <w:t>3</w:t>
+                <w:rFonts w:asciiTheme="minorEastAsia" w:hAnsiTheme="minorEastAsia" w:hint="eastAsia"/>
+                <w:sz w:val="18"/>
+                <w:szCs w:val="18"/>
+              </w:rPr>
+              <w:t>4</w:t>
             </w:r>
           </w:p>
         </w:tc>
@@ -4695,45 +4874,62 @@
                 <w:sz w:val="18"/>
                 <w:szCs w:val="18"/>
               </w:rPr>
+              <w:t xml:space="preserve">다음은 CCL, Creative Commons License에 대해서 설명 드리겠습니다. </w:t>
+            </w:r>
+          </w:p>
+          <w:p>
+            <w:pPr>
+              <w:pStyle w:val="a5"/>
+              <w:rPr>
+                <w:rFonts w:asciiTheme="minorEastAsia" w:hAnsiTheme="minorEastAsia"/>
+                <w:sz w:val="18"/>
+                <w:szCs w:val="18"/>
+              </w:rPr>
+            </w:pPr>
+            <w:r>
+              <w:rPr>
+                <w:rFonts w:asciiTheme="minorEastAsia" w:hAnsiTheme="minorEastAsia" w:hint="eastAsia"/>
+                <w:sz w:val="18"/>
+                <w:szCs w:val="18"/>
+              </w:rPr>
+              <w:t>CCL은 코드는 아니고 이미지나 문서와 같은 창작물에 대해 일정한 조건 하에 다른 사람에게 이용을 허락하는 라이선스입니다.</w:t>
+            </w:r>
+          </w:p>
+          <w:p>
+            <w:pPr>
+              <w:pStyle w:val="a5"/>
+              <w:rPr>
+                <w:rFonts w:asciiTheme="minorEastAsia" w:hAnsiTheme="minorEastAsia"/>
+                <w:sz w:val="18"/>
+                <w:szCs w:val="18"/>
+              </w:rPr>
+            </w:pPr>
+            <w:r>
+              <w:rPr>
+                <w:rFonts w:asciiTheme="minorEastAsia" w:hAnsiTheme="minorEastAsia" w:hint="eastAsia"/>
+                <w:sz w:val="18"/>
+                <w:szCs w:val="18"/>
+              </w:rPr>
               <w:lastRenderedPageBreak/>
-              <w:t xml:space="preserve">다음은 CCL, Creative Commons License에 대해서 설명 드리겠습니다. </w:t>
-            </w:r>
-          </w:p>
-          <w:p>
-            <w:pPr>
-              <w:pStyle w:val="a5"/>
-              <w:rPr>
-                <w:rFonts w:asciiTheme="minorEastAsia" w:hAnsiTheme="minorEastAsia"/>
-                <w:sz w:val="18"/>
-                <w:szCs w:val="18"/>
-              </w:rPr>
-            </w:pPr>
-            <w:r>
-              <w:rPr>
-                <w:rFonts w:asciiTheme="minorEastAsia" w:hAnsiTheme="minorEastAsia" w:hint="eastAsia"/>
-                <w:sz w:val="18"/>
-                <w:szCs w:val="18"/>
-              </w:rPr>
-              <w:lastRenderedPageBreak/>
-              <w:t>CCL은 코드는 아니고 이미지나 문서와 같은 창작물에 대해 일정한 조건 하에 다른 사람에게 이용을 허락하는 라이선스입니다.</w:t>
-            </w:r>
-          </w:p>
-          <w:p>
-            <w:pPr>
-              <w:pStyle w:val="a5"/>
-              <w:rPr>
-                <w:rFonts w:asciiTheme="minorEastAsia" w:hAnsiTheme="minorEastAsia"/>
-                <w:sz w:val="18"/>
-                <w:szCs w:val="18"/>
-              </w:rPr>
-            </w:pPr>
-            <w:r>
-              <w:rPr>
-                <w:rFonts w:asciiTheme="minorEastAsia" w:hAnsiTheme="minorEastAsia" w:hint="eastAsia"/>
-                <w:sz w:val="18"/>
-                <w:szCs w:val="18"/>
-              </w:rPr>
-              <w:t>대표적으로 우리가 위키 백과 같은데 보면 맨 아래에 크리에이티브 커먼즈-저작자 표시-동일조건변경허락과 같은 말이 있는데, 이게 바로 CCL 입니다.</w:t>
+              <w:t xml:space="preserve">대표적으로 우리가 위키 백과 같은데 보면 맨 아래에 크리에이티브 커먼즈-저작자 표시-동일조건변경허락과 같은 말이 있는데, 이게 바로 </w:t>
+            </w:r>
+            <w:proofErr w:type="gramStart"/>
+            <w:r>
+              <w:rPr>
+                <w:rFonts w:asciiTheme="minorEastAsia" w:hAnsiTheme="minorEastAsia" w:hint="eastAsia"/>
+                <w:sz w:val="18"/>
+                <w:szCs w:val="18"/>
+              </w:rPr>
+              <w:t>CCL 입니다</w:t>
+            </w:r>
+            <w:proofErr w:type="gramEnd"/>
+            <w:r>
+              <w:rPr>
+                <w:rFonts w:asciiTheme="minorEastAsia" w:hAnsiTheme="minorEastAsia" w:hint="eastAsia"/>
+                <w:sz w:val="18"/>
+                <w:szCs w:val="18"/>
+              </w:rPr>
+              <w:t>.</w:t>
             </w:r>
           </w:p>
         </w:tc>
@@ -4782,11 +4978,11 @@
             </w:r>
             <w:r>
               <w:rPr>
-                <w:rFonts w:asciiTheme="minorEastAsia" w:hAnsiTheme="minorEastAsia"/>
-                <w:sz w:val="18"/>
-                <w:szCs w:val="18"/>
-              </w:rPr>
-              <w:t>4</w:t>
+                <w:rFonts w:asciiTheme="minorEastAsia" w:hAnsiTheme="minorEastAsia" w:hint="eastAsia"/>
+                <w:sz w:val="18"/>
+                <w:szCs w:val="18"/>
+              </w:rPr>
+              <w:t>5</w:t>
             </w:r>
           </w:p>
         </w:tc>
@@ -4808,7 +5004,6 @@
         <w:tc>
           <w:tcPr>
             <w:tcW w:w="6256" w:type="dxa"/>
-            <w:shd w:val="clear" w:color="auto" w:fill="auto"/>
           </w:tcPr>
           <w:p>
             <w:pPr>
@@ -4861,7 +5056,25 @@
                 <w:sz w:val="18"/>
                 <w:szCs w:val="18"/>
               </w:rPr>
-              <w:t>NC는 Non Commercial 이라고 해서 영리 목적으로는 사용할 수 없다는 거에요. 그러니까 NC가 붙어 있으면 회사에서 사용할 수가 없어요</w:t>
+              <w:t xml:space="preserve">NC는 Non </w:t>
+            </w:r>
+            <w:proofErr w:type="gramStart"/>
+            <w:r>
+              <w:rPr>
+                <w:rFonts w:asciiTheme="minorEastAsia" w:hAnsiTheme="minorEastAsia" w:hint="eastAsia"/>
+                <w:sz w:val="18"/>
+                <w:szCs w:val="18"/>
+              </w:rPr>
+              <w:t>Commercial 이라고</w:t>
+            </w:r>
+            <w:proofErr w:type="gramEnd"/>
+            <w:r>
+              <w:rPr>
+                <w:rFonts w:asciiTheme="minorEastAsia" w:hAnsiTheme="minorEastAsia" w:hint="eastAsia"/>
+                <w:sz w:val="18"/>
+                <w:szCs w:val="18"/>
+              </w:rPr>
+              <w:t xml:space="preserve"> 해서 영리 목적으로는 사용할 수 없다는 거에요. 그러니까 NC가 붙어 있으면 회사에서 사용할 수가 없어요</w:t>
             </w:r>
             <w:r>
               <w:rPr>
@@ -4951,11 +5164,11 @@
             </w:r>
             <w:r>
               <w:rPr>
-                <w:rFonts w:asciiTheme="minorEastAsia" w:hAnsiTheme="minorEastAsia"/>
-                <w:sz w:val="18"/>
-                <w:szCs w:val="18"/>
-              </w:rPr>
-              <w:t>5</w:t>
+                <w:rFonts w:asciiTheme="minorEastAsia" w:hAnsiTheme="minorEastAsia" w:hint="eastAsia"/>
+                <w:sz w:val="18"/>
+                <w:szCs w:val="18"/>
+              </w:rPr>
+              <w:t>6</w:t>
             </w:r>
           </w:p>
         </w:tc>
@@ -5102,11 +5315,11 @@
             </w:r>
             <w:r>
               <w:rPr>
-                <w:rFonts w:asciiTheme="minorEastAsia" w:hAnsiTheme="minorEastAsia"/>
-                <w:sz w:val="18"/>
-                <w:szCs w:val="18"/>
-              </w:rPr>
-              <w:t>6</w:t>
+                <w:rFonts w:asciiTheme="minorEastAsia" w:hAnsiTheme="minorEastAsia" w:hint="eastAsia"/>
+                <w:sz w:val="18"/>
+                <w:szCs w:val="18"/>
+              </w:rPr>
+              <w:t>7</w:t>
             </w:r>
           </w:p>
         </w:tc>
@@ -5190,11 +5403,11 @@
             </w:r>
             <w:r>
               <w:rPr>
-                <w:rFonts w:asciiTheme="minorEastAsia" w:hAnsiTheme="minorEastAsia"/>
-                <w:sz w:val="18"/>
-                <w:szCs w:val="18"/>
-              </w:rPr>
-              <w:t>7</w:t>
+                <w:rFonts w:asciiTheme="minorEastAsia" w:hAnsiTheme="minorEastAsia" w:hint="eastAsia"/>
+                <w:sz w:val="18"/>
+                <w:szCs w:val="18"/>
+              </w:rPr>
+              <w:t>8</w:t>
             </w:r>
           </w:p>
         </w:tc>
@@ -5318,8 +5531,16 @@
                 <w:sz w:val="18"/>
                 <w:szCs w:val="18"/>
               </w:rPr>
+              <w:t xml:space="preserve">윤고딕도 마찬가지에요. 얘는 우리가 별도 비용을 지불하지 않고도 한컴 오피스에서는 사용 가능해요. 근데, 다른데서 윤고딕을 사용한다? 그러면 </w:t>
+            </w:r>
+            <w:r>
+              <w:rPr>
+                <w:rFonts w:asciiTheme="minorEastAsia" w:hAnsiTheme="minorEastAsia" w:hint="eastAsia"/>
+                <w:sz w:val="18"/>
+                <w:szCs w:val="18"/>
+              </w:rPr>
               <w:lastRenderedPageBreak/>
-              <w:t>윤고딕도 마찬가지에요. 얘는 우리가 별도 비용을 지불하지 않고도 한컴 오피스에서는 사용 가능해요. 근데, 다른데서 윤고딕을 사용한다? 그러면 라이선스 위반이 되는거죠.</w:t>
+              <w:t>라이선스 위반이 되는거죠.</w:t>
             </w:r>
           </w:p>
         </w:tc>
@@ -5365,11 +5586,11 @@
             </w:r>
             <w:r>
               <w:rPr>
-                <w:rFonts w:asciiTheme="minorEastAsia" w:hAnsiTheme="minorEastAsia"/>
-                <w:sz w:val="18"/>
-                <w:szCs w:val="18"/>
-              </w:rPr>
-              <w:t>8</w:t>
+                <w:rFonts w:asciiTheme="minorEastAsia" w:hAnsiTheme="minorEastAsia" w:hint="eastAsia"/>
+                <w:sz w:val="18"/>
+                <w:szCs w:val="18"/>
+              </w:rPr>
+              <w:t>9</w:t>
             </w:r>
           </w:p>
         </w:tc>
@@ -5627,15 +5848,7 @@
                 <w:sz w:val="18"/>
                 <w:szCs w:val="18"/>
               </w:rPr>
-              <w:t>3</w:t>
-            </w:r>
-            <w:r>
-              <w:rPr>
-                <w:rFonts w:asciiTheme="minorEastAsia" w:hAnsiTheme="minorEastAsia"/>
-                <w:sz w:val="18"/>
-                <w:szCs w:val="18"/>
-              </w:rPr>
-              <w:t>9</w:t>
+              <w:t>40</w:t>
             </w:r>
           </w:p>
         </w:tc>
@@ -5801,11 +6014,11 @@
             </w:r>
             <w:r>
               <w:rPr>
-                <w:rFonts w:asciiTheme="minorEastAsia" w:hAnsiTheme="minorEastAsia"/>
-                <w:sz w:val="18"/>
-                <w:szCs w:val="18"/>
-              </w:rPr>
-              <w:t>0</w:t>
+                <w:rFonts w:asciiTheme="minorEastAsia" w:hAnsiTheme="minorEastAsia" w:hint="eastAsia"/>
+                <w:sz w:val="18"/>
+                <w:szCs w:val="18"/>
+              </w:rPr>
+              <w:t>1</w:t>
             </w:r>
           </w:p>
         </w:tc>
@@ -5937,11 +6150,11 @@
             </w:r>
             <w:r>
               <w:rPr>
-                <w:rFonts w:asciiTheme="minorEastAsia" w:hAnsiTheme="minorEastAsia"/>
-                <w:sz w:val="18"/>
-                <w:szCs w:val="18"/>
-              </w:rPr>
-              <w:t>1</w:t>
+                <w:rFonts w:asciiTheme="minorEastAsia" w:hAnsiTheme="minorEastAsia" w:hint="eastAsia"/>
+                <w:sz w:val="18"/>
+                <w:szCs w:val="18"/>
+              </w:rPr>
+              <w:t>2</w:t>
             </w:r>
           </w:p>
         </w:tc>
@@ -6247,11 +6460,11 @@
             </w:r>
             <w:r>
               <w:rPr>
-                <w:rFonts w:asciiTheme="minorEastAsia" w:hAnsiTheme="minorEastAsia"/>
-                <w:sz w:val="18"/>
-                <w:szCs w:val="18"/>
-              </w:rPr>
-              <w:t>2</w:t>
+                <w:rFonts w:asciiTheme="minorEastAsia" w:hAnsiTheme="minorEastAsia" w:hint="eastAsia"/>
+                <w:sz w:val="18"/>
+                <w:szCs w:val="18"/>
+              </w:rPr>
+              <w:t>3</w:t>
             </w:r>
           </w:p>
         </w:tc>
@@ -6417,16 +6630,15 @@
                 <w:sz w:val="18"/>
                 <w:szCs w:val="18"/>
               </w:rPr>
-              <w:lastRenderedPageBreak/>
               <w:t>4</w:t>
             </w:r>
             <w:r>
               <w:rPr>
-                <w:rFonts w:asciiTheme="minorEastAsia" w:hAnsiTheme="minorEastAsia"/>
-                <w:sz w:val="18"/>
-                <w:szCs w:val="18"/>
-              </w:rPr>
-              <w:t>3</w:t>
+                <w:rFonts w:asciiTheme="minorEastAsia" w:hAnsiTheme="minorEastAsia" w:hint="eastAsia"/>
+                <w:sz w:val="18"/>
+                <w:szCs w:val="18"/>
+              </w:rPr>
+              <w:t>4</w:t>
             </w:r>
           </w:p>
         </w:tc>
@@ -6483,7 +6695,16 @@
                 <w:sz w:val="18"/>
                 <w:szCs w:val="18"/>
               </w:rPr>
-              <w:t xml:space="preserve">소스코드는 자유롭게 사용할 수 있지만 상업적 서비스는 금지하는 조항이 포함된 </w:t>
+              <w:t xml:space="preserve">소스코드는 자유롭게 사용할 수 있지만 상업적 서비스는 </w:t>
+            </w:r>
+            <w:r>
+              <w:rPr>
+                <w:rFonts w:asciiTheme="minorEastAsia" w:hAnsiTheme="minorEastAsia" w:hint="eastAsia"/>
+                <w:sz w:val="18"/>
+                <w:szCs w:val="18"/>
+              </w:rPr>
+              <w:lastRenderedPageBreak/>
+              <w:t xml:space="preserve">금지하는 조항이 포함된 </w:t>
             </w:r>
             <w:r>
               <w:rPr>
@@ -6549,7 +6770,25 @@
                 <w:sz w:val="18"/>
                 <w:szCs w:val="18"/>
               </w:rPr>
-              <w:t>라이선스로 변경된 대표적인 네가지 사례 입니다.</w:t>
+              <w:t xml:space="preserve">라이선스로 변경된 대표적인 네가지 </w:t>
+            </w:r>
+            <w:proofErr w:type="gramStart"/>
+            <w:r>
+              <w:rPr>
+                <w:rFonts w:asciiTheme="minorEastAsia" w:hAnsiTheme="minorEastAsia" w:hint="eastAsia"/>
+                <w:sz w:val="18"/>
+                <w:szCs w:val="18"/>
+              </w:rPr>
+              <w:t>사례 입니다</w:t>
+            </w:r>
+            <w:proofErr w:type="gramEnd"/>
+            <w:r>
+              <w:rPr>
+                <w:rFonts w:asciiTheme="minorEastAsia" w:hAnsiTheme="minorEastAsia" w:hint="eastAsia"/>
+                <w:sz w:val="18"/>
+                <w:szCs w:val="18"/>
+              </w:rPr>
+              <w:t>.</w:t>
             </w:r>
           </w:p>
         </w:tc>
@@ -6598,11 +6837,11 @@
             </w:r>
             <w:r>
               <w:rPr>
-                <w:rFonts w:asciiTheme="minorEastAsia" w:hAnsiTheme="minorEastAsia"/>
-                <w:sz w:val="18"/>
-                <w:szCs w:val="18"/>
-              </w:rPr>
-              <w:t>4</w:t>
+                <w:rFonts w:asciiTheme="minorEastAsia" w:hAnsiTheme="minorEastAsia" w:hint="eastAsia"/>
+                <w:sz w:val="18"/>
+                <w:szCs w:val="18"/>
+              </w:rPr>
+              <w:t>5</w:t>
             </w:r>
           </w:p>
         </w:tc>
@@ -6627,7 +6866,6 @@
         <w:tc>
           <w:tcPr>
             <w:tcW w:w="6256" w:type="dxa"/>
-            <w:shd w:val="clear" w:color="auto" w:fill="auto"/>
           </w:tcPr>
           <w:p>
             <w:pPr>
@@ -6750,7 +6988,25 @@
                 <w:sz w:val="18"/>
                 <w:szCs w:val="18"/>
               </w:rPr>
-              <w:t xml:space="preserve">여기서 서비스 코드는 프로그램 뿐만 아니라 관리하는 데에 필요한 모든 소프트웨어를 포함하기 때문에 </w:t>
+              <w:t xml:space="preserve">여기서 서비스 코드는 </w:t>
+            </w:r>
+            <w:proofErr w:type="gramStart"/>
+            <w:r>
+              <w:rPr>
+                <w:rFonts w:asciiTheme="minorEastAsia" w:hAnsiTheme="minorEastAsia" w:hint="eastAsia"/>
+                <w:sz w:val="18"/>
+                <w:szCs w:val="18"/>
+              </w:rPr>
+              <w:t>프로그램 뿐만</w:t>
+            </w:r>
+            <w:proofErr w:type="gramEnd"/>
+            <w:r>
+              <w:rPr>
+                <w:rFonts w:asciiTheme="minorEastAsia" w:hAnsiTheme="minorEastAsia" w:hint="eastAsia"/>
+                <w:sz w:val="18"/>
+                <w:szCs w:val="18"/>
+              </w:rPr>
+              <w:t xml:space="preserve"> 아니라 관리하는 데에 필요한 모든 소프트웨어를 포함하기 때문에 </w:t>
             </w:r>
             <w:r>
               <w:rPr>
@@ -6839,11 +7095,11 @@
             </w:r>
             <w:r>
               <w:rPr>
-                <w:rFonts w:asciiTheme="minorEastAsia" w:hAnsiTheme="minorEastAsia"/>
-                <w:sz w:val="18"/>
-                <w:szCs w:val="18"/>
-              </w:rPr>
-              <w:t>5</w:t>
+                <w:rFonts w:asciiTheme="minorEastAsia" w:hAnsiTheme="minorEastAsia" w:hint="eastAsia"/>
+                <w:sz w:val="18"/>
+                <w:szCs w:val="18"/>
+              </w:rPr>
+              <w:t>6</w:t>
             </w:r>
           </w:p>
         </w:tc>
@@ -7306,6 +7562,7 @@
               </w:rPr>
               <w:t>“올바른 오픈소스 코드의 사용</w:t>
             </w:r>
+            <w:proofErr w:type="gramStart"/>
             <w:r>
               <w:rPr>
                 <w:rFonts w:asciiTheme="minorEastAsia" w:hAnsiTheme="minorEastAsia"/>
@@ -7320,7 +7577,16 @@
                 <w:sz w:val="18"/>
                 <w:szCs w:val="18"/>
               </w:rPr>
-              <w:t>에 대해 살펴보겠습니다.</w:t>
+              <w:t>에</w:t>
+            </w:r>
+            <w:proofErr w:type="gramEnd"/>
+            <w:r>
+              <w:rPr>
+                <w:rFonts w:asciiTheme="minorEastAsia" w:hAnsiTheme="minorEastAsia" w:hint="eastAsia"/>
+                <w:sz w:val="18"/>
+                <w:szCs w:val="18"/>
+              </w:rPr>
+              <w:t xml:space="preserve"> 대해 살펴보겠습니다.</w:t>
             </w:r>
           </w:p>
         </w:tc>
@@ -7527,7 +7793,6 @@
         <w:tc>
           <w:tcPr>
             <w:tcW w:w="6227" w:type="dxa"/>
-            <w:shd w:val="clear" w:color="auto" w:fill="auto"/>
           </w:tcPr>
           <w:p>
             <w:pPr>
@@ -7595,7 +7860,39 @@
                 <w:sz w:val="18"/>
                 <w:szCs w:val="18"/>
               </w:rPr>
-              <w:t>개발할 때 자유롭게 사용하</w:t>
+              <w:t xml:space="preserve">개발할 때 자유롭게 사용하시면 되고, copyleft </w:t>
+            </w:r>
+            <w:r>
+              <w:rPr>
+                <w:rFonts w:asciiTheme="minorEastAsia" w:hAnsiTheme="minorEastAsia" w:hint="eastAsia"/>
+                <w:sz w:val="18"/>
+                <w:szCs w:val="18"/>
+              </w:rPr>
+              <w:t>라이선스에 해당하는 오픈소스는 사용하기 전에 소스공개를 해도 괜찮은지 판단해 보시기 바랍니다.</w:t>
+            </w:r>
+            <w:r>
+              <w:rPr>
+                <w:rFonts w:asciiTheme="minorEastAsia" w:hAnsiTheme="minorEastAsia"/>
+                <w:sz w:val="18"/>
+                <w:szCs w:val="18"/>
+              </w:rPr>
+              <w:t xml:space="preserve"> 그 외 </w:t>
+            </w:r>
+            <w:r>
+              <w:rPr>
+                <w:rFonts w:asciiTheme="minorEastAsia" w:hAnsiTheme="minorEastAsia" w:hint="eastAsia"/>
+                <w:sz w:val="18"/>
+                <w:szCs w:val="18"/>
+              </w:rPr>
+              <w:t xml:space="preserve">여기에 없는 </w:t>
+            </w:r>
+            <w:r>
+              <w:rPr>
+                <w:rFonts w:asciiTheme="minorEastAsia" w:hAnsiTheme="minorEastAsia"/>
+                <w:sz w:val="18"/>
+                <w:szCs w:val="18"/>
+              </w:rPr>
+              <w:t>오</w:t>
             </w:r>
             <w:r>
               <w:rPr>
@@ -7604,39 +7901,7 @@
                 <w:szCs w:val="18"/>
               </w:rPr>
               <w:lastRenderedPageBreak/>
-              <w:t xml:space="preserve">시면 되고, copyleft </w:t>
-            </w:r>
-            <w:r>
-              <w:rPr>
-                <w:rFonts w:asciiTheme="minorEastAsia" w:hAnsiTheme="minorEastAsia" w:hint="eastAsia"/>
-                <w:sz w:val="18"/>
-                <w:szCs w:val="18"/>
-              </w:rPr>
-              <w:t>라이선스에 해당하는 오픈소스는 사용하기 전에 소스공개를 해도 괜찮은지 판단해 보시기 바랍니다.</w:t>
-            </w:r>
-            <w:r>
-              <w:rPr>
-                <w:rFonts w:asciiTheme="minorEastAsia" w:hAnsiTheme="minorEastAsia"/>
-                <w:sz w:val="18"/>
-                <w:szCs w:val="18"/>
-              </w:rPr>
-              <w:t xml:space="preserve"> 그 외 </w:t>
-            </w:r>
-            <w:r>
-              <w:rPr>
-                <w:rFonts w:asciiTheme="minorEastAsia" w:hAnsiTheme="minorEastAsia" w:hint="eastAsia"/>
-                <w:sz w:val="18"/>
-                <w:szCs w:val="18"/>
-              </w:rPr>
-              <w:t xml:space="preserve">여기에 없는 </w:t>
-            </w:r>
-            <w:r>
-              <w:rPr>
-                <w:rFonts w:asciiTheme="minorEastAsia" w:hAnsiTheme="minorEastAsia"/>
-                <w:sz w:val="18"/>
-                <w:szCs w:val="18"/>
-              </w:rPr>
-              <w:t>오픈소스를 개발에 사용하려면 담당부서</w:t>
+              <w:t>픈소스를 개발에 사용하려면 담당부서</w:t>
             </w:r>
             <w:r>
               <w:rPr>
@@ -7996,7 +8261,6 @@
         <w:tc>
           <w:tcPr>
             <w:tcW w:w="6227" w:type="dxa"/>
-            <w:shd w:val="clear" w:color="auto" w:fill="auto"/>
           </w:tcPr>
           <w:p>
             <w:pPr>
@@ -8444,7 +8708,39 @@
                 <w:sz w:val="18"/>
                 <w:szCs w:val="18"/>
               </w:rPr>
-              <w:t xml:space="preserve">같이 소스코드를 공개해야 되는 오픈소스가 있는지 사전에 확인을 해서 만일 그런 것이 있다면 </w:t>
+              <w:t>같이 소스코드를 공개해야 되는 오픈소스가 있는지 사전에 확인을 해서 만일 그런 것이 있다면 제거하거나 다른 오픈소스로 교체를 하거나 코드 공개 준비를 하는 겁니다.</w:t>
+            </w:r>
+            <w:r>
+              <w:rPr>
+                <w:rFonts w:asciiTheme="minorEastAsia" w:hAnsiTheme="minorEastAsia"/>
+                <w:sz w:val="18"/>
+                <w:szCs w:val="18"/>
+              </w:rPr>
+              <w:t xml:space="preserve"> </w:t>
+            </w:r>
+            <w:r>
+              <w:rPr>
+                <w:rFonts w:asciiTheme="minorEastAsia" w:hAnsiTheme="minorEastAsia" w:hint="eastAsia"/>
+                <w:sz w:val="18"/>
+                <w:szCs w:val="18"/>
+              </w:rPr>
+              <w:t>이건 빨리 하면 할수록 좋습니다.</w:t>
+            </w:r>
+            <w:r>
+              <w:rPr>
+                <w:rFonts w:asciiTheme="minorEastAsia" w:hAnsiTheme="minorEastAsia"/>
+                <w:sz w:val="18"/>
+                <w:szCs w:val="18"/>
+              </w:rPr>
+              <w:t xml:space="preserve"> </w:t>
+            </w:r>
+            <w:r>
+              <w:rPr>
+                <w:rFonts w:asciiTheme="minorEastAsia" w:hAnsiTheme="minorEastAsia" w:hint="eastAsia"/>
+                <w:sz w:val="18"/>
+                <w:szCs w:val="18"/>
+              </w:rPr>
+              <w:t>왜냐하면 늦게 하면 늦게 할수</w:t>
             </w:r>
             <w:r>
               <w:rPr>
@@ -8453,39 +8749,7 @@
                 <w:szCs w:val="18"/>
               </w:rPr>
               <w:lastRenderedPageBreak/>
-              <w:t>제거하거나 다른 오픈소스로 교체를 하거나 코드 공개 준비를 하는 겁니다.</w:t>
-            </w:r>
-            <w:r>
-              <w:rPr>
-                <w:rFonts w:asciiTheme="minorEastAsia" w:hAnsiTheme="minorEastAsia"/>
-                <w:sz w:val="18"/>
-                <w:szCs w:val="18"/>
-              </w:rPr>
-              <w:t xml:space="preserve"> </w:t>
-            </w:r>
-            <w:r>
-              <w:rPr>
-                <w:rFonts w:asciiTheme="minorEastAsia" w:hAnsiTheme="minorEastAsia" w:hint="eastAsia"/>
-                <w:sz w:val="18"/>
-                <w:szCs w:val="18"/>
-              </w:rPr>
-              <w:t>이건 빨리 하면 할수록 좋습니다.</w:t>
-            </w:r>
-            <w:r>
-              <w:rPr>
-                <w:rFonts w:asciiTheme="minorEastAsia" w:hAnsiTheme="minorEastAsia"/>
-                <w:sz w:val="18"/>
-                <w:szCs w:val="18"/>
-              </w:rPr>
-              <w:t xml:space="preserve"> </w:t>
-            </w:r>
-            <w:r>
-              <w:rPr>
-                <w:rFonts w:asciiTheme="minorEastAsia" w:hAnsiTheme="minorEastAsia" w:hint="eastAsia"/>
-                <w:sz w:val="18"/>
-                <w:szCs w:val="18"/>
-              </w:rPr>
-              <w:t>왜냐하면 늦게 하면 늦게 할수록 나중에 수정을 하는데 비용이나 시간도 더 들어가게 되고,</w:t>
+              <w:t>록 나중에 수정을 하는데 비용이나 시간도 더 들어가게 되고,</w:t>
             </w:r>
             <w:r>
               <w:rPr>
@@ -9353,7 +9617,6 @@
                 <w:sz w:val="18"/>
                 <w:szCs w:val="18"/>
               </w:rPr>
-              <w:lastRenderedPageBreak/>
               <w:t>5</w:t>
             </w:r>
             <w:r>
@@ -9474,6 +9737,7 @@
                 <w:sz w:val="18"/>
                 <w:szCs w:val="18"/>
               </w:rPr>
+              <w:lastRenderedPageBreak/>
               <w:t>6</w:t>
             </w:r>
             <w:r>
@@ -9640,7 +9904,6 @@
         <w:tc>
           <w:tcPr>
             <w:tcW w:w="6227" w:type="dxa"/>
-            <w:shd w:val="clear" w:color="auto" w:fill="auto"/>
           </w:tcPr>
           <w:p>
             <w:pPr>
@@ -10742,94 +11005,102 @@
                 <w:sz w:val="18"/>
                 <w:szCs w:val="18"/>
               </w:rPr>
+              <w:t>6</w:t>
+            </w:r>
+            <w:r>
+              <w:rPr>
+                <w:rFonts w:asciiTheme="minorEastAsia" w:hAnsiTheme="minorEastAsia"/>
+                <w:sz w:val="18"/>
+                <w:szCs w:val="18"/>
+              </w:rPr>
+              <w:t>9</w:t>
+            </w:r>
+          </w:p>
+        </w:tc>
+        <w:tc>
+          <w:tcPr>
+            <w:tcW w:w="2740" w:type="dxa"/>
+          </w:tcPr>
+          <w:p>
+            <w:pPr>
+              <w:pStyle w:val="a5"/>
+              <w:rPr>
+                <w:rFonts w:asciiTheme="minorEastAsia" w:hAnsiTheme="minorEastAsia"/>
+                <w:sz w:val="18"/>
+                <w:szCs w:val="18"/>
+              </w:rPr>
+            </w:pPr>
+          </w:p>
+        </w:tc>
+        <w:tc>
+          <w:tcPr>
+            <w:tcW w:w="6227" w:type="dxa"/>
+          </w:tcPr>
+          <w:p>
+            <w:pPr>
+              <w:pStyle w:val="a5"/>
+              <w:rPr>
+                <w:rFonts w:asciiTheme="minorEastAsia" w:hAnsiTheme="minorEastAsia"/>
+                <w:sz w:val="18"/>
+                <w:szCs w:val="18"/>
+              </w:rPr>
+            </w:pPr>
+            <w:r>
+              <w:rPr>
+                <w:rFonts w:asciiTheme="minorEastAsia" w:hAnsiTheme="minorEastAsia" w:hint="eastAsia"/>
+                <w:sz w:val="18"/>
+                <w:szCs w:val="18"/>
+              </w:rPr>
+              <w:t xml:space="preserve">이거는 </w:t>
+            </w:r>
+            <w:r>
+              <w:rPr>
+                <w:rFonts w:asciiTheme="minorEastAsia" w:hAnsiTheme="minorEastAsia"/>
+                <w:sz w:val="18"/>
+                <w:szCs w:val="18"/>
+              </w:rPr>
+              <w:t>[</w:t>
+            </w:r>
+            <w:r>
+              <w:rPr>
+                <w:rFonts w:asciiTheme="minorEastAsia" w:hAnsiTheme="minorEastAsia" w:hint="eastAsia"/>
+                <w:sz w:val="18"/>
+                <w:szCs w:val="18"/>
+              </w:rPr>
+              <w:t>배포 전 체크리스트]라고 해서 개발부서에서 소프트웨어를 배포하기 전에 체크해 보시라고 만들어 본 것입니다.</w:t>
+            </w:r>
+            <w:r>
+              <w:rPr>
+                <w:rFonts w:asciiTheme="minorEastAsia" w:hAnsiTheme="minorEastAsia"/>
+                <w:sz w:val="18"/>
+                <w:szCs w:val="18"/>
+              </w:rPr>
+              <w:t xml:space="preserve"> 1</w:t>
+            </w:r>
+            <w:r>
+              <w:rPr>
+                <w:rFonts w:asciiTheme="minorEastAsia" w:hAnsiTheme="minorEastAsia"/>
+                <w:sz w:val="18"/>
+                <w:szCs w:val="18"/>
+              </w:rPr>
+              <w:t>2</w:t>
+            </w:r>
+            <w:r>
+              <w:rPr>
+                <w:rFonts w:asciiTheme="minorEastAsia" w:hAnsiTheme="minorEastAsia" w:hint="eastAsia"/>
+                <w:sz w:val="18"/>
+                <w:szCs w:val="18"/>
+              </w:rPr>
+              <w:t>문항 밖에 되지 않으</w:t>
+            </w:r>
+            <w:r>
+              <w:rPr>
+                <w:rFonts w:asciiTheme="minorEastAsia" w:hAnsiTheme="minorEastAsia" w:hint="eastAsia"/>
+                <w:sz w:val="18"/>
+                <w:szCs w:val="18"/>
+              </w:rPr>
               <w:lastRenderedPageBreak/>
-              <w:t>6</w:t>
-            </w:r>
-            <w:r>
-              <w:rPr>
-                <w:rFonts w:asciiTheme="minorEastAsia" w:hAnsiTheme="minorEastAsia"/>
-                <w:sz w:val="18"/>
-                <w:szCs w:val="18"/>
-              </w:rPr>
-              <w:t>9</w:t>
-            </w:r>
-          </w:p>
-        </w:tc>
-        <w:tc>
-          <w:tcPr>
-            <w:tcW w:w="2740" w:type="dxa"/>
-          </w:tcPr>
-          <w:p>
-            <w:pPr>
-              <w:pStyle w:val="a5"/>
-              <w:rPr>
-                <w:rFonts w:asciiTheme="minorEastAsia" w:hAnsiTheme="minorEastAsia"/>
-                <w:sz w:val="18"/>
-                <w:szCs w:val="18"/>
-              </w:rPr>
-            </w:pPr>
-          </w:p>
-        </w:tc>
-        <w:tc>
-          <w:tcPr>
-            <w:tcW w:w="6227" w:type="dxa"/>
-          </w:tcPr>
-          <w:p>
-            <w:pPr>
-              <w:pStyle w:val="a5"/>
-              <w:rPr>
-                <w:rFonts w:asciiTheme="minorEastAsia" w:hAnsiTheme="minorEastAsia"/>
-                <w:sz w:val="18"/>
-                <w:szCs w:val="18"/>
-              </w:rPr>
-            </w:pPr>
-            <w:r>
-              <w:rPr>
-                <w:rFonts w:asciiTheme="minorEastAsia" w:hAnsiTheme="minorEastAsia" w:hint="eastAsia"/>
-                <w:sz w:val="18"/>
-                <w:szCs w:val="18"/>
-              </w:rPr>
-              <w:t xml:space="preserve">이거는 </w:t>
-            </w:r>
-            <w:r>
-              <w:rPr>
-                <w:rFonts w:asciiTheme="minorEastAsia" w:hAnsiTheme="minorEastAsia"/>
-                <w:sz w:val="18"/>
-                <w:szCs w:val="18"/>
-              </w:rPr>
-              <w:t>[</w:t>
-            </w:r>
-            <w:r>
-              <w:rPr>
-                <w:rFonts w:asciiTheme="minorEastAsia" w:hAnsiTheme="minorEastAsia" w:hint="eastAsia"/>
-                <w:sz w:val="18"/>
-                <w:szCs w:val="18"/>
-              </w:rPr>
-              <w:t>배포 전 체크리스트]라고 해서 개발부서에서 소프트웨어를 배포하기 전에 체크해 보시라고 만들어 본 것입니다.</w:t>
-            </w:r>
-            <w:r>
-              <w:rPr>
-                <w:rFonts w:asciiTheme="minorEastAsia" w:hAnsiTheme="minorEastAsia"/>
-                <w:sz w:val="18"/>
-                <w:szCs w:val="18"/>
-              </w:rPr>
-              <w:t xml:space="preserve"> 1</w:t>
-            </w:r>
-            <w:r>
-              <w:rPr>
-                <w:rFonts w:asciiTheme="minorEastAsia" w:hAnsiTheme="minorEastAsia"/>
-                <w:sz w:val="18"/>
-                <w:szCs w:val="18"/>
-              </w:rPr>
-              <w:t>2</w:t>
-            </w:r>
-            <w:r>
-              <w:rPr>
-                <w:rFonts w:asciiTheme="minorEastAsia" w:hAnsiTheme="minorEastAsia" w:hint="eastAsia"/>
-                <w:sz w:val="18"/>
-                <w:szCs w:val="18"/>
-              </w:rPr>
-              <w:t>문항 밖에 되지 않으니까 나중에 체크해 보시기 바랍니다.</w:t>
+              <w:t>니까 나중에 체크해 보시기 바랍니다.</w:t>
             </w:r>
           </w:p>
         </w:tc>
@@ -11427,7 +11698,6 @@
         <w:tc>
           <w:tcPr>
             <w:tcW w:w="6227" w:type="dxa"/>
-            <w:shd w:val="clear" w:color="auto" w:fill="auto"/>
           </w:tcPr>
           <w:p>
             <w:pPr>
@@ -11576,8 +11846,8 @@
       </w:pPr>
     </w:p>
     <w:sectPr>
-      <w:headerReference w:type="default" r:id="rId8"/>
-      <w:footerReference w:type="default" r:id="rId9"/>
+      <w:headerReference w:type="default" r:id="rId11"/>
+      <w:footerReference w:type="default" r:id="rId12"/>
       <w:pgSz w:w="16838" w:h="11906" w:orient="landscape"/>
       <w:pgMar w:top="1440" w:right="1701" w:bottom="1440" w:left="1440" w:header="851" w:footer="992" w:gutter="0"/>
       <w:cols w:space="425"/>
@@ -11588,7 +11858,7 @@
 </file>
 
 <file path=word/endnotes.xml><?xml version="1.0" encoding="utf-8"?>
-<w:endnotes xmlns:wpc="http://schemas.microsoft.com/office/word/2010/wordprocessingCanvas" xmlns:cx="http://schemas.microsoft.com/office/drawing/2014/chartex" xmlns:cx1="http://schemas.microsoft.com/office/drawing/2015/9/8/chartex" xmlns:cx2="http://schemas.microsoft.com/office/drawing/2015/10/21/chartex" xmlns:cx3="http://schemas.microsoft.com/office/drawing/2016/5/9/chartex" xmlns:cx4="http://schemas.microsoft.com/office/drawing/2016/5/10/chartex" xmlns:cx5="http://schemas.microsoft.com/office/drawing/2016/5/11/chartex" xmlns:cx6="http://schemas.microsoft.com/office/drawing/2016/5/12/chartex" xmlns:cx7="http://schemas.microsoft.com/office/drawing/2016/5/13/chartex" xmlns:cx8="http://schemas.microsoft.com/office/drawing/2016/5/14/chartex" xmlns:mc="http://schemas.openxmlformats.org/markup-compatibility/2006" xmlns:aink="http://schemas.microsoft.com/office/drawing/2016/ink" xmlns:am3d="http://schemas.microsoft.com/office/drawing/2017/model3d" xmlns:o="urn:schemas-microsoft-com:office:office" xmlns:r="http://schemas.openxmlformats.org/officeDocument/2006/relationships" xmlns:m="http://schemas.openxmlformats.org/officeDocument/2006/math" xmlns:v="urn:schemas-microsoft-com:vml" xmlns:wp14="http://schemas.microsoft.com/office/word/2010/wordprocessingDrawing" xmlns:wp="http://schemas.openxmlformats.org/drawingml/2006/wordprocessingDrawing" xmlns:w10="urn:schemas-microsoft-com:office:word" xmlns:w="http://schemas.openxmlformats.org/wordprocessingml/2006/main" xmlns:w14="http://schemas.microsoft.com/office/word/2010/wordml" xmlns:w15="http://schemas.microsoft.com/office/word/2012/wordml" xmlns:w16cex="http://schemas.microsoft.com/office/word/2018/wordml/cex" xmlns:w16cid="http://schemas.microsoft.com/office/word/2016/wordml/cid" xmlns:w16="http://schemas.microsoft.com/office/word/2018/wordml" xmlns:w16sdtdh="http://schemas.microsoft.com/office/word/2020/wordml/sdtdatahash" xmlns:w16se="http://schemas.microsoft.com/office/word/2015/wordml/symex" xmlns:wpg="http://schemas.microsoft.com/office/word/2010/wordprocessingGroup" xmlns:wpi="http://schemas.microsoft.com/office/word/2010/wordprocessingInk" xmlns:wne="http://schemas.microsoft.com/office/word/2006/wordml" xmlns:wps="http://schemas.microsoft.com/office/word/2010/wordprocessingShape" mc:Ignorable="w14 w15 w16se w16cid w16 w16cex w16sdtdh wp14">
+<w:endnotes xmlns:wpc="http://schemas.microsoft.com/office/word/2010/wordprocessingCanvas" xmlns:cx="http://schemas.microsoft.com/office/drawing/2014/chartex" xmlns:cx1="http://schemas.microsoft.com/office/drawing/2015/9/8/chartex" xmlns:cx2="http://schemas.microsoft.com/office/drawing/2015/10/21/chartex" xmlns:cx3="http://schemas.microsoft.com/office/drawing/2016/5/9/chartex" xmlns:cx4="http://schemas.microsoft.com/office/drawing/2016/5/10/chartex" xmlns:cx5="http://schemas.microsoft.com/office/drawing/2016/5/11/chartex" xmlns:cx6="http://schemas.microsoft.com/office/drawing/2016/5/12/chartex" xmlns:cx7="http://schemas.microsoft.com/office/drawing/2016/5/13/chartex" xmlns:cx8="http://schemas.microsoft.com/office/drawing/2016/5/14/chartex" xmlns:mc="http://schemas.openxmlformats.org/markup-compatibility/2006" xmlns:aink="http://schemas.microsoft.com/office/drawing/2016/ink" xmlns:am3d="http://schemas.microsoft.com/office/drawing/2017/model3d" xmlns:o="urn:schemas-microsoft-com:office:office" xmlns:oel="http://schemas.microsoft.com/office/2019/extlst" xmlns:r="http://schemas.openxmlformats.org/officeDocument/2006/relationships" xmlns:m="http://schemas.openxmlformats.org/officeDocument/2006/math" xmlns:v="urn:schemas-microsoft-com:vml" xmlns:wp14="http://schemas.microsoft.com/office/word/2010/wordprocessingDrawing" xmlns:wp="http://schemas.openxmlformats.org/drawingml/2006/wordprocessingDrawing" xmlns:w10="urn:schemas-microsoft-com:office:word" xmlns:w="http://schemas.openxmlformats.org/wordprocessingml/2006/main" xmlns:w14="http://schemas.microsoft.com/office/word/2010/wordml" xmlns:w15="http://schemas.microsoft.com/office/word/2012/wordml" xmlns:w16cex="http://schemas.microsoft.com/office/word/2018/wordml/cex" xmlns:w16cid="http://schemas.microsoft.com/office/word/2016/wordml/cid" xmlns:w16="http://schemas.microsoft.com/office/word/2018/wordml" xmlns:w16du="http://schemas.microsoft.com/office/word/2023/wordml/word16du" xmlns:w16sdtdh="http://schemas.microsoft.com/office/word/2020/wordml/sdtdatahash" xmlns:w16sdtfl="http://schemas.microsoft.com/office/word/2024/wordml/sdtformatlock" xmlns:w16se="http://schemas.microsoft.com/office/word/2015/wordml/symex" xmlns:wpg="http://schemas.microsoft.com/office/word/2010/wordprocessingGroup" xmlns:wpi="http://schemas.microsoft.com/office/word/2010/wordprocessingInk" xmlns:wne="http://schemas.microsoft.com/office/word/2006/wordml" xmlns:wps="http://schemas.microsoft.com/office/word/2010/wordprocessingShape" mc:Ignorable="w14 w15 w16se w16cid w16 w16cex w16sdtdh w16sdtfl w16du wp14">
   <w:endnote w:type="separator" w:id="-1">
     <w:p>
       <w:pPr>
@@ -11620,7 +11890,7 @@
 </file>
 
 <file path=word/footer1.xml><?xml version="1.0" encoding="utf-8"?>
-<w:ftr xmlns:wpc="http://schemas.microsoft.com/office/word/2010/wordprocessingCanvas" xmlns:cx="http://schemas.microsoft.com/office/drawing/2014/chartex" xmlns:cx1="http://schemas.microsoft.com/office/drawing/2015/9/8/chartex" xmlns:cx2="http://schemas.microsoft.com/office/drawing/2015/10/21/chartex" xmlns:cx3="http://schemas.microsoft.com/office/drawing/2016/5/9/chartex" xmlns:cx4="http://schemas.microsoft.com/office/drawing/2016/5/10/chartex" xmlns:cx5="http://schemas.microsoft.com/office/drawing/2016/5/11/chartex" xmlns:cx6="http://schemas.microsoft.com/office/drawing/2016/5/12/chartex" xmlns:cx7="http://schemas.microsoft.com/office/drawing/2016/5/13/chartex" xmlns:cx8="http://schemas.microsoft.com/office/drawing/2016/5/14/chartex" xmlns:mc="http://schemas.openxmlformats.org/markup-compatibility/2006" xmlns:aink="http://schemas.microsoft.com/office/drawing/2016/ink" xmlns:am3d="http://schemas.microsoft.com/office/drawing/2017/model3d" xmlns:o="urn:schemas-microsoft-com:office:office" xmlns:r="http://schemas.openxmlformats.org/officeDocument/2006/relationships" xmlns:m="http://schemas.openxmlformats.org/officeDocument/2006/math" xmlns:v="urn:schemas-microsoft-com:vml" xmlns:wp14="http://schemas.microsoft.com/office/word/2010/wordprocessingDrawing" xmlns:wp="http://schemas.openxmlformats.org/drawingml/2006/wordprocessingDrawing" xmlns:w10="urn:schemas-microsoft-com:office:word" xmlns:w="http://schemas.openxmlformats.org/wordprocessingml/2006/main" xmlns:w14="http://schemas.microsoft.com/office/word/2010/wordml" xmlns:w15="http://schemas.microsoft.com/office/word/2012/wordml" xmlns:w16cex="http://schemas.microsoft.com/office/word/2018/wordml/cex" xmlns:w16cid="http://schemas.microsoft.com/office/word/2016/wordml/cid" xmlns:w16="http://schemas.microsoft.com/office/word/2018/wordml" xmlns:w16sdtdh="http://schemas.microsoft.com/office/word/2020/wordml/sdtdatahash" xmlns:w16se="http://schemas.microsoft.com/office/word/2015/wordml/symex" xmlns:wpg="http://schemas.microsoft.com/office/word/2010/wordprocessingGroup" xmlns:wpi="http://schemas.microsoft.com/office/word/2010/wordprocessingInk" xmlns:wne="http://schemas.microsoft.com/office/word/2006/wordml" xmlns:wps="http://schemas.microsoft.com/office/word/2010/wordprocessingShape" mc:Ignorable="w14 w15 w16se w16cid w16 w16cex w16sdtdh wp14">
+<w:ftr xmlns:wpc="http://schemas.microsoft.com/office/word/2010/wordprocessingCanvas" xmlns:cx="http://schemas.microsoft.com/office/drawing/2014/chartex" xmlns:cx1="http://schemas.microsoft.com/office/drawing/2015/9/8/chartex" xmlns:cx2="http://schemas.microsoft.com/office/drawing/2015/10/21/chartex" xmlns:cx3="http://schemas.microsoft.com/office/drawing/2016/5/9/chartex" xmlns:cx4="http://schemas.microsoft.com/office/drawing/2016/5/10/chartex" xmlns:cx5="http://schemas.microsoft.com/office/drawing/2016/5/11/chartex" xmlns:cx6="http://schemas.microsoft.com/office/drawing/2016/5/12/chartex" xmlns:cx7="http://schemas.microsoft.com/office/drawing/2016/5/13/chartex" xmlns:cx8="http://schemas.microsoft.com/office/drawing/2016/5/14/chartex" xmlns:mc="http://schemas.openxmlformats.org/markup-compatibility/2006" xmlns:aink="http://schemas.microsoft.com/office/drawing/2016/ink" xmlns:am3d="http://schemas.microsoft.com/office/drawing/2017/model3d" xmlns:o="urn:schemas-microsoft-com:office:office" xmlns:oel="http://schemas.microsoft.com/office/2019/extlst" xmlns:r="http://schemas.openxmlformats.org/officeDocument/2006/relationships" xmlns:m="http://schemas.openxmlformats.org/officeDocument/2006/math" xmlns:v="urn:schemas-microsoft-com:vml" xmlns:wp14="http://schemas.microsoft.com/office/word/2010/wordprocessingDrawing" xmlns:wp="http://schemas.openxmlformats.org/drawingml/2006/wordprocessingDrawing" xmlns:w10="urn:schemas-microsoft-com:office:word" xmlns:w="http://schemas.openxmlformats.org/wordprocessingml/2006/main" xmlns:w14="http://schemas.microsoft.com/office/word/2010/wordml" xmlns:w15="http://schemas.microsoft.com/office/word/2012/wordml" xmlns:w16cex="http://schemas.microsoft.com/office/word/2018/wordml/cex" xmlns:w16cid="http://schemas.microsoft.com/office/word/2016/wordml/cid" xmlns:w16="http://schemas.microsoft.com/office/word/2018/wordml" xmlns:w16du="http://schemas.microsoft.com/office/word/2023/wordml/word16du" xmlns:w16sdtdh="http://schemas.microsoft.com/office/word/2020/wordml/sdtdatahash" xmlns:w16sdtfl="http://schemas.microsoft.com/office/word/2024/wordml/sdtformatlock" xmlns:w16se="http://schemas.microsoft.com/office/word/2015/wordml/symex" xmlns:wpg="http://schemas.microsoft.com/office/word/2010/wordprocessingGroup" xmlns:wpi="http://schemas.microsoft.com/office/word/2010/wordprocessingInk" xmlns:wne="http://schemas.microsoft.com/office/word/2006/wordml" xmlns:wps="http://schemas.microsoft.com/office/word/2010/wordprocessingShape" mc:Ignorable="w14 w15 w16se w16cid w16 w16cex w16sdtdh w16sdtfl w16du wp14">
   <w:p>
     <w:pPr>
       <w:pStyle w:val="a4"/>
@@ -11721,7 +11991,25 @@
             <w:sz w:val="18"/>
             <w:szCs w:val="18"/>
           </w:rPr>
-          <w:t xml:space="preserve">© NCSOFT Corporation. All Rights Reserved.  </w:t>
+          <w:t>© NC</w:t>
+        </w:r>
+        <w:r>
+          <w:rPr>
+            <w:rFonts w:asciiTheme="minorEastAsia" w:hAnsiTheme="minorEastAsia" w:hint="eastAsia"/>
+            <w:i/>
+            <w:sz w:val="18"/>
+            <w:szCs w:val="18"/>
+          </w:rPr>
+          <w:t xml:space="preserve"> </w:t>
+        </w:r>
+        <w:r>
+          <w:rPr>
+            <w:rFonts w:asciiTheme="minorEastAsia" w:hAnsiTheme="minorEastAsia"/>
+            <w:i/>
+            <w:sz w:val="18"/>
+            <w:szCs w:val="18"/>
+          </w:rPr>
+          <w:t xml:space="preserve">Corporation. All Rights Reserved.  </w:t>
         </w:r>
         <w:r>
           <w:rPr>
@@ -11813,7 +12101,7 @@
 </file>
 
 <file path=word/footnotes.xml><?xml version="1.0" encoding="utf-8"?>
-<w:footnotes xmlns:wpc="http://schemas.microsoft.com/office/word/2010/wordprocessingCanvas" xmlns:cx="http://schemas.microsoft.com/office/drawing/2014/chartex" xmlns:cx1="http://schemas.microsoft.com/office/drawing/2015/9/8/chartex" xmlns:cx2="http://schemas.microsoft.com/office/drawing/2015/10/21/chartex" xmlns:cx3="http://schemas.microsoft.com/office/drawing/2016/5/9/chartex" xmlns:cx4="http://schemas.microsoft.com/office/drawing/2016/5/10/chartex" xmlns:cx5="http://schemas.microsoft.com/office/drawing/2016/5/11/chartex" xmlns:cx6="http://schemas.microsoft.com/office/drawing/2016/5/12/chartex" xmlns:cx7="http://schemas.microsoft.com/office/drawing/2016/5/13/chartex" xmlns:cx8="http://schemas.microsoft.com/office/drawing/2016/5/14/chartex" xmlns:mc="http://schemas.openxmlformats.org/markup-compatibility/2006" xmlns:aink="http://schemas.microsoft.com/office/drawing/2016/ink" xmlns:am3d="http://schemas.microsoft.com/office/drawing/2017/model3d" xmlns:o="urn:schemas-microsoft-com:office:office" xmlns:r="http://schemas.openxmlformats.org/officeDocument/2006/relationships" xmlns:m="http://schemas.openxmlformats.org/officeDocument/2006/math" xmlns:v="urn:schemas-microsoft-com:vml" xmlns:wp14="http://schemas.microsoft.com/office/word/2010/wordprocessingDrawing" xmlns:wp="http://schemas.openxmlformats.org/drawingml/2006/wordprocessingDrawing" xmlns:w10="urn:schemas-microsoft-com:office:word" xmlns:w="http://schemas.openxmlformats.org/wordprocessingml/2006/main" xmlns:w14="http://schemas.microsoft.com/office/word/2010/wordml" xmlns:w15="http://schemas.microsoft.com/office/word/2012/wordml" xmlns:w16cex="http://schemas.microsoft.com/office/word/2018/wordml/cex" xmlns:w16cid="http://schemas.microsoft.com/office/word/2016/wordml/cid" xmlns:w16="http://schemas.microsoft.com/office/word/2018/wordml" xmlns:w16sdtdh="http://schemas.microsoft.com/office/word/2020/wordml/sdtdatahash" xmlns:w16se="http://schemas.microsoft.com/office/word/2015/wordml/symex" xmlns:wpg="http://schemas.microsoft.com/office/word/2010/wordprocessingGroup" xmlns:wpi="http://schemas.microsoft.com/office/word/2010/wordprocessingInk" xmlns:wne="http://schemas.microsoft.com/office/word/2006/wordml" xmlns:wps="http://schemas.microsoft.com/office/word/2010/wordprocessingShape" mc:Ignorable="w14 w15 w16se w16cid w16 w16cex w16sdtdh wp14">
+<w:footnotes xmlns:wpc="http://schemas.microsoft.com/office/word/2010/wordprocessingCanvas" xmlns:cx="http://schemas.microsoft.com/office/drawing/2014/chartex" xmlns:cx1="http://schemas.microsoft.com/office/drawing/2015/9/8/chartex" xmlns:cx2="http://schemas.microsoft.com/office/drawing/2015/10/21/chartex" xmlns:cx3="http://schemas.microsoft.com/office/drawing/2016/5/9/chartex" xmlns:cx4="http://schemas.microsoft.com/office/drawing/2016/5/10/chartex" xmlns:cx5="http://schemas.microsoft.com/office/drawing/2016/5/11/chartex" xmlns:cx6="http://schemas.microsoft.com/office/drawing/2016/5/12/chartex" xmlns:cx7="http://schemas.microsoft.com/office/drawing/2016/5/13/chartex" xmlns:cx8="http://schemas.microsoft.com/office/drawing/2016/5/14/chartex" xmlns:mc="http://schemas.openxmlformats.org/markup-compatibility/2006" xmlns:aink="http://schemas.microsoft.com/office/drawing/2016/ink" xmlns:am3d="http://schemas.microsoft.com/office/drawing/2017/model3d" xmlns:o="urn:schemas-microsoft-com:office:office" xmlns:oel="http://schemas.microsoft.com/office/2019/extlst" xmlns:r="http://schemas.openxmlformats.org/officeDocument/2006/relationships" xmlns:m="http://schemas.openxmlformats.org/officeDocument/2006/math" xmlns:v="urn:schemas-microsoft-com:vml" xmlns:wp14="http://schemas.microsoft.com/office/word/2010/wordprocessingDrawing" xmlns:wp="http://schemas.openxmlformats.org/drawingml/2006/wordprocessingDrawing" xmlns:w10="urn:schemas-microsoft-com:office:word" xmlns:w="http://schemas.openxmlformats.org/wordprocessingml/2006/main" xmlns:w14="http://schemas.microsoft.com/office/word/2010/wordml" xmlns:w15="http://schemas.microsoft.com/office/word/2012/wordml" xmlns:w16cex="http://schemas.microsoft.com/office/word/2018/wordml/cex" xmlns:w16cid="http://schemas.microsoft.com/office/word/2016/wordml/cid" xmlns:w16="http://schemas.microsoft.com/office/word/2018/wordml" xmlns:w16du="http://schemas.microsoft.com/office/word/2023/wordml/word16du" xmlns:w16sdtdh="http://schemas.microsoft.com/office/word/2020/wordml/sdtdatahash" xmlns:w16sdtfl="http://schemas.microsoft.com/office/word/2024/wordml/sdtformatlock" xmlns:w16se="http://schemas.microsoft.com/office/word/2015/wordml/symex" xmlns:wpg="http://schemas.microsoft.com/office/word/2010/wordprocessingGroup" xmlns:wpi="http://schemas.microsoft.com/office/word/2010/wordprocessingInk" xmlns:wne="http://schemas.microsoft.com/office/word/2006/wordml" xmlns:wps="http://schemas.microsoft.com/office/word/2010/wordprocessingShape" mc:Ignorable="w14 w15 w16se w16cid w16 w16cex w16sdtdh w16sdtfl w16du wp14">
   <w:footnote w:type="separator" w:id="-1">
     <w:p>
       <w:pPr>
@@ -11845,7 +12133,7 @@
 </file>
 
 <file path=word/header1.xml><?xml version="1.0" encoding="utf-8"?>
-<w:hdr xmlns:wpc="http://schemas.microsoft.com/office/word/2010/wordprocessingCanvas" xmlns:cx="http://schemas.microsoft.com/office/drawing/2014/chartex" xmlns:cx1="http://schemas.microsoft.com/office/drawing/2015/9/8/chartex" xmlns:cx2="http://schemas.microsoft.com/office/drawing/2015/10/21/chartex" xmlns:cx3="http://schemas.microsoft.com/office/drawing/2016/5/9/chartex" xmlns:cx4="http://schemas.microsoft.com/office/drawing/2016/5/10/chartex" xmlns:cx5="http://schemas.microsoft.com/office/drawing/2016/5/11/chartex" xmlns:cx6="http://schemas.microsoft.com/office/drawing/2016/5/12/chartex" xmlns:cx7="http://schemas.microsoft.com/office/drawing/2016/5/13/chartex" xmlns:cx8="http://schemas.microsoft.com/office/drawing/2016/5/14/chartex" xmlns:mc="http://schemas.openxmlformats.org/markup-compatibility/2006" xmlns:aink="http://schemas.microsoft.com/office/drawing/2016/ink" xmlns:am3d="http://schemas.microsoft.com/office/drawing/2017/model3d" xmlns:o="urn:schemas-microsoft-com:office:office" xmlns:r="http://schemas.openxmlformats.org/officeDocument/2006/relationships" xmlns:m="http://schemas.openxmlformats.org/officeDocument/2006/math" xmlns:v="urn:schemas-microsoft-com:vml" xmlns:wp14="http://schemas.microsoft.com/office/word/2010/wordprocessingDrawing" xmlns:wp="http://schemas.openxmlformats.org/drawingml/2006/wordprocessingDrawing" xmlns:w10="urn:schemas-microsoft-com:office:word" xmlns:w="http://schemas.openxmlformats.org/wordprocessingml/2006/main" xmlns:w14="http://schemas.microsoft.com/office/word/2010/wordml" xmlns:w15="http://schemas.microsoft.com/office/word/2012/wordml" xmlns:w16cex="http://schemas.microsoft.com/office/word/2018/wordml/cex" xmlns:w16cid="http://schemas.microsoft.com/office/word/2016/wordml/cid" xmlns:w16="http://schemas.microsoft.com/office/word/2018/wordml" xmlns:w16sdtdh="http://schemas.microsoft.com/office/word/2020/wordml/sdtdatahash" xmlns:w16se="http://schemas.microsoft.com/office/word/2015/wordml/symex" xmlns:wpg="http://schemas.microsoft.com/office/word/2010/wordprocessingGroup" xmlns:wpi="http://schemas.microsoft.com/office/word/2010/wordprocessingInk" xmlns:wne="http://schemas.microsoft.com/office/word/2006/wordml" xmlns:wps="http://schemas.microsoft.com/office/word/2010/wordprocessingShape" mc:Ignorable="w14 w15 w16se w16cid w16 w16cex w16sdtdh wp14">
+<w:hdr xmlns:wpc="http://schemas.microsoft.com/office/word/2010/wordprocessingCanvas" xmlns:cx="http://schemas.microsoft.com/office/drawing/2014/chartex" xmlns:cx1="http://schemas.microsoft.com/office/drawing/2015/9/8/chartex" xmlns:cx2="http://schemas.microsoft.com/office/drawing/2015/10/21/chartex" xmlns:cx3="http://schemas.microsoft.com/office/drawing/2016/5/9/chartex" xmlns:cx4="http://schemas.microsoft.com/office/drawing/2016/5/10/chartex" xmlns:cx5="http://schemas.microsoft.com/office/drawing/2016/5/11/chartex" xmlns:cx6="http://schemas.microsoft.com/office/drawing/2016/5/12/chartex" xmlns:cx7="http://schemas.microsoft.com/office/drawing/2016/5/13/chartex" xmlns:cx8="http://schemas.microsoft.com/office/drawing/2016/5/14/chartex" xmlns:mc="http://schemas.openxmlformats.org/markup-compatibility/2006" xmlns:aink="http://schemas.microsoft.com/office/drawing/2016/ink" xmlns:am3d="http://schemas.microsoft.com/office/drawing/2017/model3d" xmlns:o="urn:schemas-microsoft-com:office:office" xmlns:oel="http://schemas.microsoft.com/office/2019/extlst" xmlns:r="http://schemas.openxmlformats.org/officeDocument/2006/relationships" xmlns:m="http://schemas.openxmlformats.org/officeDocument/2006/math" xmlns:v="urn:schemas-microsoft-com:vml" xmlns:wp14="http://schemas.microsoft.com/office/word/2010/wordprocessingDrawing" xmlns:wp="http://schemas.openxmlformats.org/drawingml/2006/wordprocessingDrawing" xmlns:w10="urn:schemas-microsoft-com:office:word" xmlns:w="http://schemas.openxmlformats.org/wordprocessingml/2006/main" xmlns:w14="http://schemas.microsoft.com/office/word/2010/wordml" xmlns:w15="http://schemas.microsoft.com/office/word/2012/wordml" xmlns:w16cex="http://schemas.microsoft.com/office/word/2018/wordml/cex" xmlns:w16cid="http://schemas.microsoft.com/office/word/2016/wordml/cid" xmlns:w16="http://schemas.microsoft.com/office/word/2018/wordml" xmlns:w16du="http://schemas.microsoft.com/office/word/2023/wordml/word16du" xmlns:w16sdtdh="http://schemas.microsoft.com/office/word/2020/wordml/sdtdatahash" xmlns:w16sdtfl="http://schemas.microsoft.com/office/word/2024/wordml/sdtformatlock" xmlns:w16se="http://schemas.microsoft.com/office/word/2015/wordml/symex" xmlns:wpg="http://schemas.microsoft.com/office/word/2010/wordprocessingGroup" xmlns:wpi="http://schemas.microsoft.com/office/word/2010/wordprocessingInk" xmlns:wne="http://schemas.microsoft.com/office/word/2006/wordml" xmlns:wps="http://schemas.microsoft.com/office/word/2010/wordprocessingShape" mc:Ignorable="w14 w15 w16se w16cid w16 w16cex w16sdtdh w16sdtfl w16du wp14">
   <w:p>
     <w:pPr>
       <w:pStyle w:val="a3"/>
@@ -11938,7 +12226,7 @@
 </file>
 
 <file path=word/numbering.xml><?xml version="1.0" encoding="utf-8"?>
-<w:numbering xmlns:wpc="http://schemas.microsoft.com/office/word/2010/wordprocessingCanvas" xmlns:cx="http://schemas.microsoft.com/office/drawing/2014/chartex" xmlns:cx1="http://schemas.microsoft.com/office/drawing/2015/9/8/chartex" xmlns:cx2="http://schemas.microsoft.com/office/drawing/2015/10/21/chartex" xmlns:cx3="http://schemas.microsoft.com/office/drawing/2016/5/9/chartex" xmlns:cx4="http://schemas.microsoft.com/office/drawing/2016/5/10/chartex" xmlns:cx5="http://schemas.microsoft.com/office/drawing/2016/5/11/chartex" xmlns:cx6="http://schemas.microsoft.com/office/drawing/2016/5/12/chartex" xmlns:cx7="http://schemas.microsoft.com/office/drawing/2016/5/13/chartex" xmlns:cx8="http://schemas.microsoft.com/office/drawing/2016/5/14/chartex" xmlns:mc="http://schemas.openxmlformats.org/markup-compatibility/2006" xmlns:aink="http://schemas.microsoft.com/office/drawing/2016/ink" xmlns:am3d="http://schemas.microsoft.com/office/drawing/2017/model3d" xmlns:o="urn:schemas-microsoft-com:office:office" xmlns:r="http://schemas.openxmlformats.org/officeDocument/2006/relationships" xmlns:m="http://schemas.openxmlformats.org/officeDocument/2006/math" xmlns:v="urn:schemas-microsoft-com:vml" xmlns:wp14="http://schemas.microsoft.com/office/word/2010/wordprocessingDrawing" xmlns:wp="http://schemas.openxmlformats.org/drawingml/2006/wordprocessingDrawing" xmlns:w10="urn:schemas-microsoft-com:office:word" xmlns:w="http://schemas.openxmlformats.org/wordprocessingml/2006/main" xmlns:w14="http://schemas.microsoft.com/office/word/2010/wordml" xmlns:w15="http://schemas.microsoft.com/office/word/2012/wordml" xmlns:w16cex="http://schemas.microsoft.com/office/word/2018/wordml/cex" xmlns:w16cid="http://schemas.microsoft.com/office/word/2016/wordml/cid" xmlns:w16="http://schemas.microsoft.com/office/word/2018/wordml" xmlns:w16sdtdh="http://schemas.microsoft.com/office/word/2020/wordml/sdtdatahash" xmlns:w16se="http://schemas.microsoft.com/office/word/2015/wordml/symex" xmlns:wpg="http://schemas.microsoft.com/office/word/2010/wordprocessingGroup" xmlns:wpi="http://schemas.microsoft.com/office/word/2010/wordprocessingInk" xmlns:wne="http://schemas.microsoft.com/office/word/2006/wordml" xmlns:wps="http://schemas.microsoft.com/office/word/2010/wordprocessingShape" mc:Ignorable="w14 w15 w16se w16cid w16 w16cex w16sdtdh wp14">
+<w:numbering xmlns:wpc="http://schemas.microsoft.com/office/word/2010/wordprocessingCanvas" xmlns:cx="http://schemas.microsoft.com/office/drawing/2014/chartex" xmlns:cx1="http://schemas.microsoft.com/office/drawing/2015/9/8/chartex" xmlns:cx2="http://schemas.microsoft.com/office/drawing/2015/10/21/chartex" xmlns:cx3="http://schemas.microsoft.com/office/drawing/2016/5/9/chartex" xmlns:cx4="http://schemas.microsoft.com/office/drawing/2016/5/10/chartex" xmlns:cx5="http://schemas.microsoft.com/office/drawing/2016/5/11/chartex" xmlns:cx6="http://schemas.microsoft.com/office/drawing/2016/5/12/chartex" xmlns:cx7="http://schemas.microsoft.com/office/drawing/2016/5/13/chartex" xmlns:cx8="http://schemas.microsoft.com/office/drawing/2016/5/14/chartex" xmlns:mc="http://schemas.openxmlformats.org/markup-compatibility/2006" xmlns:aink="http://schemas.microsoft.com/office/drawing/2016/ink" xmlns:am3d="http://schemas.microsoft.com/office/drawing/2017/model3d" xmlns:o="urn:schemas-microsoft-com:office:office" xmlns:oel="http://schemas.microsoft.com/office/2019/extlst" xmlns:r="http://schemas.openxmlformats.org/officeDocument/2006/relationships" xmlns:m="http://schemas.openxmlformats.org/officeDocument/2006/math" xmlns:v="urn:schemas-microsoft-com:vml" xmlns:wp14="http://schemas.microsoft.com/office/word/2010/wordprocessingDrawing" xmlns:wp="http://schemas.openxmlformats.org/drawingml/2006/wordprocessingDrawing" xmlns:w10="urn:schemas-microsoft-com:office:word" xmlns:w="http://schemas.openxmlformats.org/wordprocessingml/2006/main" xmlns:w14="http://schemas.microsoft.com/office/word/2010/wordml" xmlns:w15="http://schemas.microsoft.com/office/word/2012/wordml" xmlns:w16cex="http://schemas.microsoft.com/office/word/2018/wordml/cex" xmlns:w16cid="http://schemas.microsoft.com/office/word/2016/wordml/cid" xmlns:w16="http://schemas.microsoft.com/office/word/2018/wordml" xmlns:w16du="http://schemas.microsoft.com/office/word/2023/wordml/word16du" xmlns:w16sdtdh="http://schemas.microsoft.com/office/word/2020/wordml/sdtdatahash" xmlns:w16sdtfl="http://schemas.microsoft.com/office/word/2024/wordml/sdtformatlock" xmlns:w16se="http://schemas.microsoft.com/office/word/2015/wordml/symex" xmlns:wpg="http://schemas.microsoft.com/office/word/2010/wordprocessingGroup" xmlns:wpi="http://schemas.microsoft.com/office/word/2010/wordprocessingInk" xmlns:wne="http://schemas.microsoft.com/office/word/2006/wordml" xmlns:wps="http://schemas.microsoft.com/office/word/2010/wordprocessingShape" mc:Ignorable="w14 w15 w16se w16cid w16 w16cex w16sdtdh w16sdtfl w16du wp14">
   <w:abstractNum w:abstractNumId="0" w15:restartNumberingAfterBreak="0">
     <w:nsid w:val="002F32F7"/>
     <w:multiLevelType w:val="hybridMultilevel"/>
@@ -15564,119 +15852,119 @@
       </w:rPr>
     </w:lvl>
   </w:abstractNum>
-  <w:num w:numId="1">
+  <w:num w:numId="1" w16cid:durableId="1469594463">
     <w:abstractNumId w:val="31"/>
   </w:num>
-  <w:num w:numId="2">
+  <w:num w:numId="2" w16cid:durableId="347948780">
     <w:abstractNumId w:val="10"/>
   </w:num>
-  <w:num w:numId="3">
+  <w:num w:numId="3" w16cid:durableId="1087582506">
     <w:abstractNumId w:val="32"/>
   </w:num>
-  <w:num w:numId="4">
+  <w:num w:numId="4" w16cid:durableId="301616297">
     <w:abstractNumId w:val="20"/>
   </w:num>
-  <w:num w:numId="5">
+  <w:num w:numId="5" w16cid:durableId="1148091347">
     <w:abstractNumId w:val="23"/>
   </w:num>
-  <w:num w:numId="6">
+  <w:num w:numId="6" w16cid:durableId="1980259113">
     <w:abstractNumId w:val="33"/>
   </w:num>
-  <w:num w:numId="7">
+  <w:num w:numId="7" w16cid:durableId="933903066">
     <w:abstractNumId w:val="3"/>
   </w:num>
-  <w:num w:numId="8">
+  <w:num w:numId="8" w16cid:durableId="629481054">
     <w:abstractNumId w:val="24"/>
   </w:num>
-  <w:num w:numId="9">
+  <w:num w:numId="9" w16cid:durableId="1732268607">
     <w:abstractNumId w:val="29"/>
   </w:num>
-  <w:num w:numId="10">
+  <w:num w:numId="10" w16cid:durableId="582690473">
     <w:abstractNumId w:val="30"/>
   </w:num>
-  <w:num w:numId="11">
+  <w:num w:numId="11" w16cid:durableId="1097209135">
     <w:abstractNumId w:val="8"/>
   </w:num>
-  <w:num w:numId="12">
+  <w:num w:numId="12" w16cid:durableId="1428229044">
     <w:abstractNumId w:val="35"/>
   </w:num>
-  <w:num w:numId="13">
+  <w:num w:numId="13" w16cid:durableId="1738242534">
     <w:abstractNumId w:val="16"/>
   </w:num>
-  <w:num w:numId="14">
+  <w:num w:numId="14" w16cid:durableId="1964772443">
     <w:abstractNumId w:val="4"/>
   </w:num>
-  <w:num w:numId="15">
+  <w:num w:numId="15" w16cid:durableId="381442009">
     <w:abstractNumId w:val="1"/>
   </w:num>
-  <w:num w:numId="16">
+  <w:num w:numId="16" w16cid:durableId="582375425">
     <w:abstractNumId w:val="5"/>
   </w:num>
-  <w:num w:numId="17">
+  <w:num w:numId="17" w16cid:durableId="1551305505">
     <w:abstractNumId w:val="19"/>
   </w:num>
-  <w:num w:numId="18">
+  <w:num w:numId="18" w16cid:durableId="1375231208">
     <w:abstractNumId w:val="7"/>
   </w:num>
-  <w:num w:numId="19">
+  <w:num w:numId="19" w16cid:durableId="1936473997">
     <w:abstractNumId w:val="9"/>
   </w:num>
-  <w:num w:numId="20">
+  <w:num w:numId="20" w16cid:durableId="1833789472">
     <w:abstractNumId w:val="22"/>
   </w:num>
-  <w:num w:numId="21">
+  <w:num w:numId="21" w16cid:durableId="377585388">
     <w:abstractNumId w:val="14"/>
   </w:num>
-  <w:num w:numId="22">
+  <w:num w:numId="22" w16cid:durableId="1288047068">
     <w:abstractNumId w:val="12"/>
   </w:num>
-  <w:num w:numId="23">
+  <w:num w:numId="23" w16cid:durableId="867253812">
     <w:abstractNumId w:val="17"/>
   </w:num>
-  <w:num w:numId="24">
+  <w:num w:numId="24" w16cid:durableId="1529181557">
     <w:abstractNumId w:val="26"/>
   </w:num>
-  <w:num w:numId="25">
+  <w:num w:numId="25" w16cid:durableId="1040544871">
     <w:abstractNumId w:val="2"/>
   </w:num>
-  <w:num w:numId="26">
+  <w:num w:numId="26" w16cid:durableId="1536389240">
     <w:abstractNumId w:val="27"/>
   </w:num>
-  <w:num w:numId="27">
+  <w:num w:numId="27" w16cid:durableId="1996251413">
     <w:abstractNumId w:val="15"/>
   </w:num>
-  <w:num w:numId="28">
+  <w:num w:numId="28" w16cid:durableId="1365131556">
     <w:abstractNumId w:val="18"/>
   </w:num>
-  <w:num w:numId="29">
+  <w:num w:numId="29" w16cid:durableId="139420568">
     <w:abstractNumId w:val="0"/>
   </w:num>
-  <w:num w:numId="30">
+  <w:num w:numId="30" w16cid:durableId="777218052">
     <w:abstractNumId w:val="6"/>
   </w:num>
-  <w:num w:numId="31">
+  <w:num w:numId="31" w16cid:durableId="2127196524">
     <w:abstractNumId w:val="21"/>
   </w:num>
-  <w:num w:numId="32">
+  <w:num w:numId="32" w16cid:durableId="1047100441">
     <w:abstractNumId w:val="34"/>
   </w:num>
-  <w:num w:numId="33">
+  <w:num w:numId="33" w16cid:durableId="1368020025">
     <w:abstractNumId w:val="28"/>
   </w:num>
-  <w:num w:numId="34">
+  <w:num w:numId="34" w16cid:durableId="1884294467">
     <w:abstractNumId w:val="13"/>
   </w:num>
-  <w:num w:numId="35">
+  <w:num w:numId="35" w16cid:durableId="1942251562">
     <w:abstractNumId w:val="11"/>
   </w:num>
-  <w:num w:numId="36">
+  <w:num w:numId="36" w16cid:durableId="251863696">
     <w:abstractNumId w:val="25"/>
   </w:num>
 </w:numbering>
 </file>
 
 <file path=word/styles.xml><?xml version="1.0" encoding="utf-8"?>
-<w:styles xmlns:mc="http://schemas.openxmlformats.org/markup-compatibility/2006" xmlns:r="http://schemas.openxmlformats.org/officeDocument/2006/relationships" xmlns:w="http://schemas.openxmlformats.org/wordprocessingml/2006/main" xmlns:w14="http://schemas.microsoft.com/office/word/2010/wordml" xmlns:w15="http://schemas.microsoft.com/office/word/2012/wordml" xmlns:w16cex="http://schemas.microsoft.com/office/word/2018/wordml/cex" xmlns:w16cid="http://schemas.microsoft.com/office/word/2016/wordml/cid" xmlns:w16="http://schemas.microsoft.com/office/word/2018/wordml" xmlns:w16sdtdh="http://schemas.microsoft.com/office/word/2020/wordml/sdtdatahash" xmlns:w16se="http://schemas.microsoft.com/office/word/2015/wordml/symex" mc:Ignorable="w14 w15 w16se w16cid w16 w16cex w16sdtdh">
+<w:styles xmlns:mc="http://schemas.openxmlformats.org/markup-compatibility/2006" xmlns:r="http://schemas.openxmlformats.org/officeDocument/2006/relationships" xmlns:w="http://schemas.openxmlformats.org/wordprocessingml/2006/main" xmlns:w14="http://schemas.microsoft.com/office/word/2010/wordml" xmlns:w15="http://schemas.microsoft.com/office/word/2012/wordml" xmlns:w16cex="http://schemas.microsoft.com/office/word/2018/wordml/cex" xmlns:w16cid="http://schemas.microsoft.com/office/word/2016/wordml/cid" xmlns:w16="http://schemas.microsoft.com/office/word/2018/wordml" xmlns:w16du="http://schemas.microsoft.com/office/word/2023/wordml/word16du" xmlns:w16sdtdh="http://schemas.microsoft.com/office/word/2020/wordml/sdtdatahash" xmlns:w16sdtfl="http://schemas.microsoft.com/office/word/2024/wordml/sdtformatlock" xmlns:w16se="http://schemas.microsoft.com/office/word/2015/wordml/symex" mc:Ignorable="w14 w15 w16se w16cid w16 w16cex w16sdtdh w16sdtfl w16du">
   <w:docDefaults>
     <w:rPrDefault>
       <w:rPr>
@@ -16624,13 +16912,324 @@
 </file>
 
 <file path=customXml/item1.xml><?xml version="1.0" encoding="utf-8"?>
+<?mso-contentType ?>
+<FormTemplates xmlns="http://schemas.microsoft.com/sharepoint/v3/contenttype/forms">
+  <Display>DocumentLibraryForm</Display>
+  <Edit>DocumentLibraryForm</Edit>
+  <New>DocumentLibraryForm</New>
+</FormTemplates>
+</file>
+
+<file path=customXml/item2.xml><?xml version="1.0" encoding="utf-8"?>
+<ct:contentTypeSchema xmlns:ct="http://schemas.microsoft.com/office/2006/metadata/contentType" xmlns:ma="http://schemas.microsoft.com/office/2006/metadata/properties/metaAttributes" ct:_="" ma:_="" ma:contentTypeName="문서" ma:contentTypeID="0x010100936099F4407C1A4C818BB7E80FAA8A72" ma:contentTypeVersion="17" ma:contentTypeDescription="새 문서를 만듭니다." ma:contentTypeScope="" ma:versionID="e1510041c8f20eaa1bcdd56dfec225a3">
+  <xsd:schema xmlns:xsd="http://www.w3.org/2001/XMLSchema" xmlns:xs="http://www.w3.org/2001/XMLSchema" xmlns:p="http://schemas.microsoft.com/office/2006/metadata/properties" xmlns:ns2="18a2a5d9-8e53-4ce3-ac8f-a54bd6377cc9" xmlns:ns3="65229a6e-0bbf-43f0-8c04-70cff9076724" targetNamespace="http://schemas.microsoft.com/office/2006/metadata/properties" ma:root="true" ma:fieldsID="b7f6a8094f9b5328fab1b7e16c4cab41" ns2:_="" ns3:_="">
+    <xsd:import namespace="18a2a5d9-8e53-4ce3-ac8f-a54bd6377cc9"/>
+    <xsd:import namespace="65229a6e-0bbf-43f0-8c04-70cff9076724"/>
+    <xsd:element name="properties">
+      <xsd:complexType>
+        <xsd:sequence>
+          <xsd:element name="documentManagement">
+            <xsd:complexType>
+              <xsd:all>
+                <xsd:element ref="ns2:MediaServiceMetadata" minOccurs="0"/>
+                <xsd:element ref="ns2:MediaServiceFastMetadata" minOccurs="0"/>
+                <xsd:element ref="ns2:MediaServiceDateTaken" minOccurs="0"/>
+                <xsd:element ref="ns2:MediaServiceAutoTags" minOccurs="0"/>
+                <xsd:element ref="ns2:MediaLengthInSeconds" minOccurs="0"/>
+                <xsd:element ref="ns2:MediaServiceGenerationTime" minOccurs="0"/>
+                <xsd:element ref="ns2:MediaServiceEventHashCode" minOccurs="0"/>
+                <xsd:element ref="ns2:MediaServiceOCR" minOccurs="0"/>
+                <xsd:element ref="ns2:MediaServiceLocation" minOccurs="0"/>
+                <xsd:element ref="ns2:lcf76f155ced4ddcb4097134ff3c332f" minOccurs="0"/>
+                <xsd:element ref="ns3:TaxCatchAll" minOccurs="0"/>
+                <xsd:element ref="ns2:MediaServiceObjectDetectorVersions" minOccurs="0"/>
+                <xsd:element ref="ns2:MediaServiceSearchProperties" minOccurs="0"/>
+                <xsd:element ref="ns3:SharedWithUsers" minOccurs="0"/>
+                <xsd:element ref="ns3:SharedWithDetails" minOccurs="0"/>
+                <xsd:element ref="ns2:MediaServiceBillingMetadata" minOccurs="0"/>
+              </xsd:all>
+            </xsd:complexType>
+          </xsd:element>
+        </xsd:sequence>
+      </xsd:complexType>
+    </xsd:element>
+  </xsd:schema>
+  <xsd:schema xmlns:xsd="http://www.w3.org/2001/XMLSchema" xmlns:xs="http://www.w3.org/2001/XMLSchema" xmlns:dms="http://schemas.microsoft.com/office/2006/documentManagement/types" xmlns:pc="http://schemas.microsoft.com/office/infopath/2007/PartnerControls" targetNamespace="18a2a5d9-8e53-4ce3-ac8f-a54bd6377cc9" elementFormDefault="qualified">
+    <xsd:import namespace="http://schemas.microsoft.com/office/2006/documentManagement/types"/>
+    <xsd:import namespace="http://schemas.microsoft.com/office/infopath/2007/PartnerControls"/>
+    <xsd:element name="MediaServiceMetadata" ma:index="8" nillable="true" ma:displayName="MediaServiceMetadata" ma:hidden="true" ma:internalName="MediaServiceMetadata" ma:readOnly="true">
+      <xsd:simpleType>
+        <xsd:restriction base="dms:Note"/>
+      </xsd:simpleType>
+    </xsd:element>
+    <xsd:element name="MediaServiceFastMetadata" ma:index="9" nillable="true" ma:displayName="MediaServiceFastMetadata" ma:hidden="true" ma:internalName="MediaServiceFastMetadata" ma:readOnly="true">
+      <xsd:simpleType>
+        <xsd:restriction base="dms:Note"/>
+      </xsd:simpleType>
+    </xsd:element>
+    <xsd:element name="MediaServiceDateTaken" ma:index="10" nillable="true" ma:displayName="MediaServiceDateTaken" ma:hidden="true" ma:internalName="MediaServiceDateTaken" ma:readOnly="true">
+      <xsd:simpleType>
+        <xsd:restriction base="dms:Text"/>
+      </xsd:simpleType>
+    </xsd:element>
+    <xsd:element name="MediaServiceAutoTags" ma:index="11" nillable="true" ma:displayName="Tags" ma:internalName="MediaServiceAutoTags" ma:readOnly="true">
+      <xsd:simpleType>
+        <xsd:restriction base="dms:Text"/>
+      </xsd:simpleType>
+    </xsd:element>
+    <xsd:element name="MediaLengthInSeconds" ma:index="12" nillable="true" ma:displayName="MediaLengthInSeconds" ma:hidden="true" ma:internalName="MediaLengthInSeconds" ma:readOnly="true">
+      <xsd:simpleType>
+        <xsd:restriction base="dms:Unknown"/>
+      </xsd:simpleType>
+    </xsd:element>
+    <xsd:element name="MediaServiceGenerationTime" ma:index="13" nillable="true" ma:displayName="MediaServiceGenerationTime" ma:hidden="true" ma:internalName="MediaServiceGenerationTime" ma:readOnly="true">
+      <xsd:simpleType>
+        <xsd:restriction base="dms:Text"/>
+      </xsd:simpleType>
+    </xsd:element>
+    <xsd:element name="MediaServiceEventHashCode" ma:index="14" nillable="true" ma:displayName="MediaServiceEventHashCode" ma:hidden="true" ma:internalName="MediaServiceEventHashCode" ma:readOnly="true">
+      <xsd:simpleType>
+        <xsd:restriction base="dms:Text"/>
+      </xsd:simpleType>
+    </xsd:element>
+    <xsd:element name="MediaServiceOCR" ma:index="15" nillable="true" ma:displayName="Extracted Text" ma:internalName="MediaServiceOCR" ma:readOnly="true">
+      <xsd:simpleType>
+        <xsd:restriction base="dms:Note">
+          <xsd:maxLength value="255"/>
+        </xsd:restriction>
+      </xsd:simpleType>
+    </xsd:element>
+    <xsd:element name="MediaServiceLocation" ma:index="16" nillable="true" ma:displayName="Location" ma:internalName="MediaServiceLocation" ma:readOnly="true">
+      <xsd:simpleType>
+        <xsd:restriction base="dms:Text"/>
+      </xsd:simpleType>
+    </xsd:element>
+    <xsd:element name="lcf76f155ced4ddcb4097134ff3c332f" ma:index="18" nillable="true" ma:taxonomy="true" ma:internalName="lcf76f155ced4ddcb4097134ff3c332f" ma:taxonomyFieldName="MediaServiceImageTags" ma:displayName="이미지 태그" ma:readOnly="false" ma:fieldId="{5cf76f15-5ced-4ddc-b409-7134ff3c332f}" ma:taxonomyMulti="true" ma:sspId="951e23c8-3cf6-4465-b3d7-081091b4a51d" ma:termSetId="09814cd3-568e-fe90-9814-8d621ff8fb84" ma:anchorId="fba54fb3-c3e1-fe81-a776-ca4b69148c4d" ma:open="true" ma:isKeyword="false">
+      <xsd:complexType>
+        <xsd:sequence>
+          <xsd:element ref="pc:Terms" minOccurs="0" maxOccurs="1"/>
+        </xsd:sequence>
+      </xsd:complexType>
+    </xsd:element>
+    <xsd:element name="MediaServiceObjectDetectorVersions" ma:index="20" nillable="true" ma:displayName="MediaServiceObjectDetectorVersions" ma:hidden="true" ma:indexed="true" ma:internalName="MediaServiceObjectDetectorVersions" ma:readOnly="true">
+      <xsd:simpleType>
+        <xsd:restriction base="dms:Text"/>
+      </xsd:simpleType>
+    </xsd:element>
+    <xsd:element name="MediaServiceSearchProperties" ma:index="21" nillable="true" ma:displayName="MediaServiceSearchProperties" ma:hidden="true" ma:internalName="MediaServiceSearchProperties" ma:readOnly="true">
+      <xsd:simpleType>
+        <xsd:restriction base="dms:Note"/>
+      </xsd:simpleType>
+    </xsd:element>
+    <xsd:element name="MediaServiceBillingMetadata" ma:index="24" nillable="true" ma:displayName="MediaServiceBillingMetadata" ma:hidden="true" ma:internalName="MediaServiceBillingMetadata" ma:readOnly="true">
+      <xsd:simpleType>
+        <xsd:restriction base="dms:Note"/>
+      </xsd:simpleType>
+    </xsd:element>
+  </xsd:schema>
+  <xsd:schema xmlns:xsd="http://www.w3.org/2001/XMLSchema" xmlns:xs="http://www.w3.org/2001/XMLSchema" xmlns:dms="http://schemas.microsoft.com/office/2006/documentManagement/types" xmlns:pc="http://schemas.microsoft.com/office/infopath/2007/PartnerControls" targetNamespace="65229a6e-0bbf-43f0-8c04-70cff9076724" elementFormDefault="qualified">
+    <xsd:import namespace="http://schemas.microsoft.com/office/2006/documentManagement/types"/>
+    <xsd:import namespace="http://schemas.microsoft.com/office/infopath/2007/PartnerControls"/>
+    <xsd:element name="TaxCatchAll" ma:index="19" nillable="true" ma:displayName="Taxonomy Catch All Column" ma:hidden="true" ma:list="{93a38e59-ff1d-46c0-800f-bb49f25e0c6a}" ma:internalName="TaxCatchAll" ma:showField="CatchAllData" ma:web="65229a6e-0bbf-43f0-8c04-70cff9076724">
+      <xsd:complexType>
+        <xsd:complexContent>
+          <xsd:extension base="dms:MultiChoiceLookup">
+            <xsd:sequence>
+              <xsd:element name="Value" type="dms:Lookup" maxOccurs="unbounded" minOccurs="0" nillable="true"/>
+            </xsd:sequence>
+          </xsd:extension>
+        </xsd:complexContent>
+      </xsd:complexType>
+    </xsd:element>
+    <xsd:element name="SharedWithUsers" ma:index="22" nillable="true" ma:displayName="공유 대상" ma:internalName="SharedWithUsers" ma:readOnly="true">
+      <xsd:complexType>
+        <xsd:complexContent>
+          <xsd:extension base="dms:UserMulti">
+            <xsd:sequence>
+              <xsd:element name="UserInfo" minOccurs="0" maxOccurs="unbounded">
+                <xsd:complexType>
+                  <xsd:sequence>
+                    <xsd:element name="DisplayName" type="xsd:string" minOccurs="0"/>
+                    <xsd:element name="AccountId" type="dms:UserId" minOccurs="0" nillable="true"/>
+                    <xsd:element name="AccountType" type="xsd:string" minOccurs="0"/>
+                  </xsd:sequence>
+                </xsd:complexType>
+              </xsd:element>
+            </xsd:sequence>
+          </xsd:extension>
+        </xsd:complexContent>
+      </xsd:complexType>
+    </xsd:element>
+    <xsd:element name="SharedWithDetails" ma:index="23" nillable="true" ma:displayName="세부 정보 공유" ma:internalName="SharedWithDetails" ma:readOnly="true">
+      <xsd:simpleType>
+        <xsd:restriction base="dms:Note">
+          <xsd:maxLength value="255"/>
+        </xsd:restriction>
+      </xsd:simpleType>
+    </xsd:element>
+  </xsd:schema>
+  <xsd:schema xmlns="http://schemas.openxmlformats.org/package/2006/metadata/core-properties" xmlns:xsd="http://www.w3.org/2001/XMLSchema" xmlns:xsi="http://www.w3.org/2001/XMLSchema-instance" xmlns:dc="http://purl.org/dc/elements/1.1/" xmlns:dcterms="http://purl.org/dc/terms/" xmlns:odoc="http://schemas.microsoft.com/internal/obd" targetNamespace="http://schemas.openxmlformats.org/package/2006/metadata/core-properties" elementFormDefault="qualified" attributeFormDefault="unqualified" blockDefault="#all">
+    <xsd:import namespace="http://purl.org/dc/elements/1.1/" schemaLocation="http://dublincore.org/schemas/xmls/qdc/2003/04/02/dc.xsd"/>
+    <xsd:import namespace="http://purl.org/dc/terms/" schemaLocation="http://dublincore.org/schemas/xmls/qdc/2003/04/02/dcterms.xsd"/>
+    <xsd:element name="coreProperties" type="CT_coreProperties"/>
+    <xsd:complexType name="CT_coreProperties">
+      <xsd:all>
+        <xsd:element ref="dc:creator" minOccurs="0" maxOccurs="1"/>
+        <xsd:element ref="dcterms:created" minOccurs="0" maxOccurs="1"/>
+        <xsd:element ref="dc:identifier" minOccurs="0" maxOccurs="1"/>
+        <xsd:element name="contentType" minOccurs="0" maxOccurs="1" type="xsd:string" ma:index="0" ma:displayName="콘텐츠 형식"/>
+        <xsd:element ref="dc:title" minOccurs="0" maxOccurs="1" ma:index="4" ma:displayName="제목"/>
+        <xsd:element ref="dc:subject" minOccurs="0" maxOccurs="1"/>
+        <xsd:element ref="dc:description" minOccurs="0" maxOccurs="1"/>
+        <xsd:element name="keywords" minOccurs="0" maxOccurs="1" type="xsd:string"/>
+        <xsd:element ref="dc:language" minOccurs="0" maxOccurs="1"/>
+        <xsd:element name="category" minOccurs="0" maxOccurs="1" type="xsd:string"/>
+        <xsd:element name="version" minOccurs="0" maxOccurs="1" type="xsd:string"/>
+        <xsd:element name="revision" minOccurs="0" maxOccurs="1" type="xsd:string">
+          <xsd:annotation>
+            <xsd:documentation>
+                        This value indicates the number of saves or revisions. The application is responsible for updating this value after each revision.
+                    </xsd:documentation>
+          </xsd:annotation>
+        </xsd:element>
+        <xsd:element name="lastModifiedBy" minOccurs="0" maxOccurs="1" type="xsd:string"/>
+        <xsd:element ref="dcterms:modified" minOccurs="0" maxOccurs="1"/>
+        <xsd:element name="contentStatus" minOccurs="0" maxOccurs="1" type="xsd:string"/>
+      </xsd:all>
+    </xsd:complexType>
+  </xsd:schema>
+  <xs:schema xmlns:pc="http://schemas.microsoft.com/office/infopath/2007/PartnerControls" xmlns:xs="http://www.w3.org/2001/XMLSchema" targetNamespace="http://schemas.microsoft.com/office/infopath/2007/PartnerControls" elementFormDefault="qualified" attributeFormDefault="unqualified">
+    <xs:element name="Person">
+      <xs:complexType>
+        <xs:sequence>
+          <xs:element ref="pc:DisplayName" minOccurs="0"/>
+          <xs:element ref="pc:AccountId" minOccurs="0"/>
+          <xs:element ref="pc:AccountType" minOccurs="0"/>
+        </xs:sequence>
+      </xs:complexType>
+    </xs:element>
+    <xs:element name="DisplayName" type="xs:string"/>
+    <xs:element name="AccountId" type="xs:string"/>
+    <xs:element name="AccountType" type="xs:string"/>
+    <xs:element name="BDCAssociatedEntity">
+      <xs:complexType>
+        <xs:sequence>
+          <xs:element ref="pc:BDCEntity" minOccurs="0" maxOccurs="unbounded"/>
+        </xs:sequence>
+        <xs:attribute ref="pc:EntityNamespace"/>
+        <xs:attribute ref="pc:EntityName"/>
+        <xs:attribute ref="pc:SystemInstanceName"/>
+        <xs:attribute ref="pc:AssociationName"/>
+      </xs:complexType>
+    </xs:element>
+    <xs:attribute name="EntityNamespace" type="xs:string"/>
+    <xs:attribute name="EntityName" type="xs:string"/>
+    <xs:attribute name="SystemInstanceName" type="xs:string"/>
+    <xs:attribute name="AssociationName" type="xs:string"/>
+    <xs:element name="BDCEntity">
+      <xs:complexType>
+        <xs:sequence>
+          <xs:element ref="pc:EntityDisplayName" minOccurs="0"/>
+          <xs:element ref="pc:EntityInstanceReference" minOccurs="0"/>
+          <xs:element ref="pc:EntityId1" minOccurs="0"/>
+          <xs:element ref="pc:EntityId2" minOccurs="0"/>
+          <xs:element ref="pc:EntityId3" minOccurs="0"/>
+          <xs:element ref="pc:EntityId4" minOccurs="0"/>
+          <xs:element ref="pc:EntityId5" minOccurs="0"/>
+        </xs:sequence>
+      </xs:complexType>
+    </xs:element>
+    <xs:element name="EntityDisplayName" type="xs:string"/>
+    <xs:element name="EntityInstanceReference" type="xs:string"/>
+    <xs:element name="EntityId1" type="xs:string"/>
+    <xs:element name="EntityId2" type="xs:string"/>
+    <xs:element name="EntityId3" type="xs:string"/>
+    <xs:element name="EntityId4" type="xs:string"/>
+    <xs:element name="EntityId5" type="xs:string"/>
+    <xs:element name="Terms">
+      <xs:complexType>
+        <xs:sequence>
+          <xs:element ref="pc:TermInfo" minOccurs="0" maxOccurs="unbounded"/>
+        </xs:sequence>
+      </xs:complexType>
+    </xs:element>
+    <xs:element name="TermInfo">
+      <xs:complexType>
+        <xs:sequence>
+          <xs:element ref="pc:TermName" minOccurs="0"/>
+          <xs:element ref="pc:TermId" minOccurs="0"/>
+        </xs:sequence>
+      </xs:complexType>
+    </xs:element>
+    <xs:element name="TermName" type="xs:string"/>
+    <xs:element name="TermId" type="xs:string"/>
+  </xs:schema>
+</ct:contentTypeSchema>
+</file>
+
+<file path=customXml/item3.xml><?xml version="1.0" encoding="utf-8"?>
 <b:Sources xmlns:b="http://schemas.openxmlformats.org/officeDocument/2006/bibliography" xmlns="http://schemas.openxmlformats.org/officeDocument/2006/bibliography" SelectedStyle="\APASixthEditionOfficeOnline.xsl" StyleName="APA" Version="6"/>
 </file>
 
+<file path=customXml/item4.xml><?xml version="1.0" encoding="utf-8"?>
+<p:properties xmlns:p="http://schemas.microsoft.com/office/2006/metadata/properties" xmlns:xsi="http://www.w3.org/2001/XMLSchema-instance" xmlns:pc="http://schemas.microsoft.com/office/infopath/2007/PartnerControls">
+  <documentManagement>
+    <lcf76f155ced4ddcb4097134ff3c332f xmlns="18a2a5d9-8e53-4ce3-ac8f-a54bd6377cc9">
+      <Terms xmlns="http://schemas.microsoft.com/office/infopath/2007/PartnerControls"/>
+    </lcf76f155ced4ddcb4097134ff3c332f>
+    <TaxCatchAll xmlns="65229a6e-0bbf-43f0-8c04-70cff9076724" xsi:nil="true"/>
+  </documentManagement>
+</p:properties>
+</file>
+
 <file path=customXml/itemProps1.xml><?xml version="1.0" encoding="utf-8"?>
+<ds:datastoreItem xmlns:ds="http://schemas.openxmlformats.org/officeDocument/2006/customXml" ds:itemID="{6B37B856-C092-4CD2-9738-AD69C0227D1D}">
+  <ds:schemaRefs>
+    <ds:schemaRef ds:uri="http://schemas.microsoft.com/sharepoint/v3/contenttype/forms"/>
+  </ds:schemaRefs>
+</ds:datastoreItem>
+</file>
+
+<file path=customXml/itemProps2.xml><?xml version="1.0" encoding="utf-8"?>
+<ds:datastoreItem xmlns:ds="http://schemas.openxmlformats.org/officeDocument/2006/customXml" ds:itemID="{52565AFD-F297-4BC6-91D6-83859D98E8F8}">
+  <ds:schemaRefs>
+    <ds:schemaRef ds:uri="http://schemas.microsoft.com/office/2006/metadata/contentType"/>
+    <ds:schemaRef ds:uri="http://schemas.microsoft.com/office/2006/metadata/properties/metaAttributes"/>
+    <ds:schemaRef ds:uri="http://www.w3.org/2001/XMLSchema"/>
+    <ds:schemaRef ds:uri="http://schemas.microsoft.com/office/2006/metadata/properties"/>
+    <ds:schemaRef ds:uri="18a2a5d9-8e53-4ce3-ac8f-a54bd6377cc9"/>
+    <ds:schemaRef ds:uri="65229a6e-0bbf-43f0-8c04-70cff9076724"/>
+    <ds:schemaRef ds:uri="http://schemas.microsoft.com/office/2006/documentManagement/types"/>
+    <ds:schemaRef ds:uri="http://schemas.microsoft.com/office/infopath/2007/PartnerControls"/>
+    <ds:schemaRef ds:uri="http://schemas.openxmlformats.org/package/2006/metadata/core-properties"/>
+    <ds:schemaRef ds:uri="http://purl.org/dc/elements/1.1/"/>
+    <ds:schemaRef ds:uri="http://purl.org/dc/terms/"/>
+    <ds:schemaRef ds:uri="http://schemas.microsoft.com/internal/obd"/>
+  </ds:schemaRefs>
+</ds:datastoreItem>
+</file>
+
+<file path=customXml/itemProps3.xml><?xml version="1.0" encoding="utf-8"?>
 <ds:datastoreItem xmlns:ds="http://schemas.openxmlformats.org/officeDocument/2006/customXml" ds:itemID="{B039E7C3-87AA-4C60-AC2D-4D383CFE61E4}">
   <ds:schemaRefs>
     <ds:schemaRef ds:uri="http://schemas.openxmlformats.org/officeDocument/2006/bibliography"/>
   </ds:schemaRefs>
 </ds:datastoreItem>
+</file>
+
+<file path=customXml/itemProps4.xml><?xml version="1.0" encoding="utf-8"?>
+<ds:datastoreItem xmlns:ds="http://schemas.openxmlformats.org/officeDocument/2006/customXml" ds:itemID="{51FBA45A-0473-4291-BDDA-9E6BB8EAADFB}">
+  <ds:schemaRefs>
+    <ds:schemaRef ds:uri="http://schemas.microsoft.com/office/2006/metadata/properties"/>
+    <ds:schemaRef ds:uri="http://schemas.microsoft.com/office/infopath/2007/PartnerControls"/>
+    <ds:schemaRef ds:uri="18a2a5d9-8e53-4ce3-ac8f-a54bd6377cc9"/>
+    <ds:schemaRef ds:uri="65229a6e-0bbf-43f0-8c04-70cff9076724"/>
+  </ds:schemaRefs>
+</ds:datastoreItem>
+</file>
+
+<file path=docMetadata/LabelInfo.xml><?xml version="1.0" encoding="utf-8"?>
+<clbl:labelList xmlns:clbl="http://schemas.microsoft.com/office/2020/mipLabelMetadata">
+  <clbl:label id="{91856527-a446-4990-b48e-37ca10f2ee8d}" enabled="0" method="" siteId="{91856527-a446-4990-b48e-37ca10f2ee8d}" removed="1"/>
+</clbl:labelList>
 </file>
</xml_diff>